<commit_message>
Schritt 4: Merkblätter, Papierhilfekette und lesbare Strategiekarten angleichen
</commit_message>
<xml_diff>
--- a/materialien/merkblaetter/Merkblaetter_Wunschbriefe_DIN_A5_Mathe_angepasst.docx
+++ b/materialien/merkblaetter/Merkblaetter_Wunschbriefe_DIN_A5_Mathe_angepasst.docx
@@ -4,2306 +4,778 @@
   <w:body>
     <w:p>
       <w:pPr>
-        <w:spacing w:after="40"/>
+        <w:pStyle w:val="Title"/>
+        <w:pageBreakBefore w:val="0"/>
       </w:pPr>
       <w:r>
-        <w:rPr>
-          <w:rFonts w:ascii="Aptos" w:hAnsi="Aptos" w:eastAsia="Aptos"/>
-          <w:b/>
-          <w:color w:val="D97A4A"/>
-          <w:sz w:val="21"/>
-        </w:rPr>
         <w:t>Merkblatt 1</w:t>
       </w:r>
     </w:p>
     <w:p>
       <w:pPr>
-        <w:spacing w:after="80"/>
+        <w:pStyle w:val="Heading1"/>
       </w:pPr>
       <w:r>
-        <w:rPr>
-          <w:rFonts w:ascii="Aptos" w:hAnsi="Aptos" w:eastAsia="Aptos"/>
-          <w:b/>
-          <w:color w:val="3E5668"/>
-          <w:sz w:val="36"/>
-        </w:rPr>
         <w:t>Eine Schreibsituation verstehen</w:t>
       </w:r>
     </w:p>
     <w:p>
       <w:pPr>
-        <w:spacing w:before="0" w:after="140"/>
+        <w:shd w:fill="EEF2F4"/>
       </w:pPr>
       <w:r>
         <w:rPr>
-          <w:rFonts w:ascii="Aptos" w:hAnsi="Aptos" w:eastAsia="Aptos"/>
-          <w:b w:val="0"/>
-          <w:sz w:val="23"/>
+          <w:b/>
         </w:rPr>
-        <w:t>Bevor du schreibst, klärst du die wichtigsten Informationen.</w:t>
+        <w:t>Das hilft dir:</w:t>
+        <w:br/>
       </w:r>
-    </w:p>
-    <w:tbl>
-      <w:tblPr>
-        <w:tblW w:type="auto" w:w="0"/>
-        <w:jc w:val="center"/>
-        <w:tblLayout w:type="autofit"/>
-        <w:tblLook w:firstColumn="1" w:firstRow="1" w:lastColumn="0" w:lastRow="0" w:noHBand="0" w:noVBand="1" w:val="04A0"/>
-      </w:tblPr>
-      <w:tblGrid>
-        <w:gridCol w:w="7371"/>
-      </w:tblGrid>
-      <w:tr>
-        <w:tc>
-          <w:tcPr>
-            <w:tcW w:type="dxa" w:w="7371"/>
-            <w:shd w:fill="EEF2F4"/>
-            <w:tcMar>
-              <w:top w:w="120" w:type="dxa"/>
-              <w:start w:w="130" w:type="dxa"/>
-              <w:bottom w:w="120" w:type="dxa"/>
-              <w:end w:w="130" w:type="dxa"/>
-            </w:tcMar>
-          </w:tcPr>
-          <w:p/>
-          <w:p>
-            <w:pPr>
-              <w:spacing w:before="0" w:after="60"/>
-            </w:pPr>
-            <w:r>
-              <w:rPr>
-                <w:rFonts w:ascii="Aptos" w:hAnsi="Aptos" w:eastAsia="Aptos"/>
-                <w:b/>
-                <w:color w:val="3E5668"/>
-                <w:sz w:val="23"/>
-              </w:rPr>
-              <w:t>Vier Fragen vor dem Schreiben</w:t>
-            </w:r>
-          </w:p>
-          <w:p>
-            <w:pPr>
-              <w:spacing w:before="0" w:after="40"/>
-              <w:ind w:left="198"/>
-            </w:pPr>
-            <w:r>
-              <w:rPr>
-                <w:rFonts w:ascii="Aptos" w:hAnsi="Aptos" w:eastAsia="Aptos"/>
-                <w:b w:val="0"/>
-                <w:sz w:val="21"/>
-              </w:rPr>
-              <w:t>• Wer schreibt?</w:t>
-            </w:r>
-          </w:p>
-          <w:p>
-            <w:pPr>
-              <w:spacing w:before="0" w:after="40"/>
-              <w:ind w:left="198"/>
-            </w:pPr>
-            <w:r>
-              <w:rPr>
-                <w:rFonts w:ascii="Aptos" w:hAnsi="Aptos" w:eastAsia="Aptos"/>
-                <w:b w:val="0"/>
-                <w:sz w:val="21"/>
-              </w:rPr>
-              <w:t>• An wen schreibe ich?</w:t>
-            </w:r>
-          </w:p>
-          <w:p>
-            <w:pPr>
-              <w:spacing w:before="0" w:after="40"/>
-              <w:ind w:left="198"/>
-            </w:pPr>
-            <w:r>
-              <w:rPr>
-                <w:rFonts w:ascii="Aptos" w:hAnsi="Aptos" w:eastAsia="Aptos"/>
-                <w:b w:val="0"/>
-                <w:sz w:val="21"/>
-              </w:rPr>
-              <w:t>• Was wünsche ich mir?</w:t>
-            </w:r>
-          </w:p>
-          <w:p>
-            <w:pPr>
-              <w:spacing w:before="0" w:after="40"/>
-              <w:ind w:left="198"/>
-            </w:pPr>
-            <w:r>
-              <w:rPr>
-                <w:rFonts w:ascii="Aptos" w:hAnsi="Aptos" w:eastAsia="Aptos"/>
-                <w:b w:val="0"/>
-                <w:sz w:val="21"/>
-              </w:rPr>
-              <w:t>• Warum schreibe ich den Brief?</w:t>
-            </w:r>
-          </w:p>
-        </w:tc>
-      </w:tr>
-    </w:tbl>
-    <w:p>
-      <w:pPr>
-        <w:spacing w:after="0"/>
-      </w:pPr>
-    </w:p>
-    <w:tbl>
-      <w:tblPr>
-        <w:tblW w:type="auto" w:w="0"/>
-        <w:jc w:val="center"/>
-        <w:tblLayout w:type="autofit"/>
-        <w:tblLook w:firstColumn="1" w:firstRow="1" w:lastColumn="0" w:lastRow="0" w:noHBand="0" w:noVBand="1" w:val="04A0"/>
-      </w:tblPr>
-      <w:tblGrid>
-        <w:gridCol w:w="7371"/>
-      </w:tblGrid>
-      <w:tr>
-        <w:tc>
-          <w:tcPr>
-            <w:tcW w:type="dxa" w:w="7371"/>
-            <w:shd w:fill="EEF6EA"/>
-            <w:tcMar>
-              <w:top w:w="120" w:type="dxa"/>
-              <w:start w:w="130" w:type="dxa"/>
-              <w:bottom w:w="120" w:type="dxa"/>
-              <w:end w:w="130" w:type="dxa"/>
-            </w:tcMar>
-          </w:tcPr>
-          <w:p/>
-          <w:p>
-            <w:pPr>
-              <w:spacing w:before="0" w:after="60"/>
-            </w:pPr>
-            <w:r>
-              <w:rPr>
-                <w:rFonts w:ascii="Aptos" w:hAnsi="Aptos" w:eastAsia="Aptos"/>
-                <w:b/>
-                <w:color w:val="4D8B3F"/>
-                <w:sz w:val="23"/>
-              </w:rPr>
-              <w:t>Passt ein Umfrageergebnis dazu?</w:t>
-            </w:r>
-          </w:p>
-          <w:p>
-            <w:pPr>
-              <w:spacing w:before="0" w:after="40"/>
-              <w:ind w:left="198"/>
-            </w:pPr>
-            <w:r>
-              <w:rPr>
-                <w:rFonts w:ascii="Aptos" w:hAnsi="Aptos" w:eastAsia="Aptos"/>
-                <w:b w:val="0"/>
-                <w:sz w:val="21"/>
-              </w:rPr>
-              <w:t>• Gibt es eine Umfrage zu meinem Wunsch?</w:t>
-            </w:r>
-          </w:p>
-          <w:p>
-            <w:pPr>
-              <w:spacing w:before="0" w:after="40"/>
-              <w:ind w:left="198"/>
-            </w:pPr>
-            <w:r>
-              <w:rPr>
-                <w:rFonts w:ascii="Aptos" w:hAnsi="Aptos" w:eastAsia="Aptos"/>
-                <w:b w:val="0"/>
-                <w:sz w:val="21"/>
-              </w:rPr>
-              <w:t>• Zeigt die Zahl wirklich meinen Wunsch?</w:t>
-            </w:r>
-          </w:p>
-          <w:p>
-            <w:pPr>
-              <w:spacing w:before="0" w:after="40"/>
-              <w:ind w:left="198"/>
-            </w:pPr>
-            <w:r>
-              <w:rPr>
-                <w:rFonts w:ascii="Aptos" w:hAnsi="Aptos" w:eastAsia="Aptos"/>
-                <w:b w:val="0"/>
-                <w:sz w:val="21"/>
-              </w:rPr>
-              <w:t>• Nutze ich Beispieldaten oder echte Ergebnisse aus Mathematik?</w:t>
-            </w:r>
-          </w:p>
-        </w:tc>
-      </w:tr>
-    </w:tbl>
-    <w:p>
-      <w:pPr>
-        <w:spacing w:after="0"/>
-      </w:pPr>
-    </w:p>
-    <w:p>
-      <w:pPr>
-        <w:spacing w:before="40" w:after="40"/>
-      </w:pPr>
       <w:r>
-        <w:rPr>
-          <w:rFonts w:ascii="Aptos" w:hAnsi="Aptos" w:eastAsia="Aptos"/>
-          <w:b/>
-          <w:color w:val="D97A4A"/>
-          <w:sz w:val="23"/>
-        </w:rPr>
-        <w:t>Merksatz</w:t>
+        <w:t>Du klärst, an wen du schreibst und was du möchtest.</w:t>
       </w:r>
     </w:p>
     <w:p>
       <w:pPr>
-        <w:spacing w:before="0" w:after="80"/>
+        <w:pStyle w:val="Heading2"/>
       </w:pPr>
       <w:r>
-        <w:rPr>
-          <w:rFonts w:ascii="Aptos" w:hAnsi="Aptos" w:eastAsia="Aptos"/>
-          <w:b w:val="0"/>
-          <w:sz w:val="22"/>
-        </w:rPr>
-        <w:t>Ein Umfrageergebnis ist eine zusätzliche Information. Der Wunsch muss auch ohne die Zahl verständlich sein.</w:t>
+        <w:t>Lies den Auftrag. Kläre diese Fragen:</w:t>
+      </w:r>
+    </w:p>
+    <w:p>
+      <w:r>
+        <w:t>Wer schreibt den Brief?</w:t>
+      </w:r>
+    </w:p>
+    <w:p>
+      <w:r>
+        <w:t>Wer bekommt den Brief?</w:t>
+      </w:r>
+    </w:p>
+    <w:p>
+      <w:r>
+        <w:t>Was wünschst du dir für die Schule?</w:t>
+      </w:r>
+    </w:p>
+    <w:p>
+      <w:r>
+        <w:t>Welcher weitere Satz passt dazu?</w:t>
       </w:r>
     </w:p>
     <w:p>
       <w:pPr>
-        <w:sectPr>
-          <w:pgSz w:w="8391" w:h="11906"/>
-          <w:pgMar w:top="510" w:right="510" w:bottom="510" w:left="510" w:header="720" w:footer="720" w:gutter="0"/>
-          <w:cols w:space="720"/>
-          <w:docGrid w:linePitch="360"/>
-        </w:sectPr>
+        <w:shd w:fill="EEF2F4"/>
       </w:pPr>
+      <w:r>
+        <w:rPr>
+          <w:b/>
+        </w:rPr>
+        <w:t>Beispiel</w:t>
+        <w:br/>
+      </w:r>
+      <w:r>
+        <w:t>Du schreibst an die Schulleitung. Du wünschst dir Sitzbänke. Du ergänzt: „Ich würde mich darüber sehr freuen.“</w:t>
+      </w:r>
+    </w:p>
+    <w:p>
+      <w:r>
+        <w:t>Sage deinen Plan erst mündlich. Notiere dann Stichwörter. Blatt 16 hilft dir beim Planen.</w:t>
+      </w:r>
     </w:p>
     <w:p>
       <w:pPr>
-        <w:spacing w:after="40"/>
+        <w:shd w:fill="EEF2F4"/>
       </w:pPr>
       <w:r>
         <w:rPr>
-          <w:rFonts w:ascii="Aptos" w:hAnsi="Aptos" w:eastAsia="Aptos"/>
           <w:b/>
-          <w:color w:val="D97A4A"/>
-          <w:sz w:val="21"/>
         </w:rPr>
+        <w:t>Zusatz · freiwillig</w:t>
+        <w:br/>
+      </w:r>
+      <w:r>
+        <w:t>Du kannst einen Grund oder ein passendes Umfrageergebnis ergänzen. Ohne diese Zusätze kann dein Brief auch gelingen.</w:t>
+      </w:r>
+    </w:p>
+    <w:p>
+      <w:pPr>
+        <w:pStyle w:val="Title"/>
+        <w:pageBreakBefore/>
+      </w:pPr>
+      <w:r>
         <w:t>Merkblatt 2</w:t>
       </w:r>
     </w:p>
     <w:p>
       <w:pPr>
-        <w:spacing w:after="80"/>
+        <w:pStyle w:val="Heading1"/>
       </w:pPr>
       <w:r>
-        <w:rPr>
-          <w:rFonts w:ascii="Aptos" w:hAnsi="Aptos" w:eastAsia="Aptos"/>
-          <w:b/>
-          <w:color w:val="3E5668"/>
-          <w:sz w:val="36"/>
-        </w:rPr>
         <w:t>So ist ein Brief aufgebaut</w:t>
       </w:r>
     </w:p>
     <w:p>
       <w:pPr>
-        <w:spacing w:before="0" w:after="140"/>
+        <w:shd w:fill="EEF2F4"/>
       </w:pPr>
       <w:r>
         <w:rPr>
-          <w:rFonts w:ascii="Aptos" w:hAnsi="Aptos" w:eastAsia="Aptos"/>
-          <w:b w:val="0"/>
-          <w:sz w:val="23"/>
+          <w:b/>
         </w:rPr>
-        <w:t>Die Teile eines Briefes stehen in einer festen Reihenfolge.</w:t>
+        <w:t>Das hilft dir:</w:t>
+        <w:br/>
+      </w:r>
+      <w:r>
+        <w:t>Du ordnest die fünf Briefteile.</w:t>
       </w:r>
     </w:p>
-    <w:tbl>
-      <w:tblPr>
-        <w:tblW w:type="auto" w:w="0"/>
-        <w:jc w:val="center"/>
-        <w:tblLook w:firstColumn="1" w:firstRow="1" w:lastColumn="0" w:lastRow="0" w:noHBand="0" w:noVBand="1" w:val="04A0"/>
-      </w:tblPr>
-      <w:tblGrid>
-        <w:gridCol w:w="3685"/>
-        <w:gridCol w:w="3685"/>
-      </w:tblGrid>
-      <w:tr>
-        <w:tc>
-          <w:tcPr>
-            <w:tcW w:type="dxa" w:w="3685"/>
-            <w:shd w:fill="3E5668"/>
-            <w:vAlign w:val="center"/>
-          </w:tcPr>
-          <w:p>
-            <w:r>
-              <w:rPr>
-                <w:rFonts w:ascii="Aptos" w:hAnsi="Aptos" w:eastAsia="Aptos"/>
-                <w:b/>
-                <w:color w:val="FFFFFF"/>
-                <w:sz w:val="24"/>
-              </w:rPr>
-              <w:t>1</w:t>
-            </w:r>
-          </w:p>
-        </w:tc>
-        <w:tc>
-          <w:tcPr>
-            <w:tcW w:type="dxa" w:w="3685"/>
-            <w:shd w:fill="F3F5F6"/>
-            <w:vAlign w:val="center"/>
-          </w:tcPr>
-          <w:p>
-            <w:r>
-              <w:rPr>
-                <w:rFonts w:ascii="Aptos" w:hAnsi="Aptos" w:eastAsia="Aptos"/>
-                <w:b w:val="0"/>
-                <w:sz w:val="23"/>
-              </w:rPr>
-              <w:t>Ort und Datum</w:t>
-            </w:r>
-          </w:p>
-        </w:tc>
-      </w:tr>
-      <w:tr>
-        <w:tc>
-          <w:tcPr>
-            <w:tcW w:type="dxa" w:w="3685"/>
-            <w:shd w:fill="3E5668"/>
-            <w:vAlign w:val="center"/>
-          </w:tcPr>
-          <w:p>
-            <w:r>
-              <w:rPr>
-                <w:rFonts w:ascii="Aptos" w:hAnsi="Aptos" w:eastAsia="Aptos"/>
-                <w:b/>
-                <w:color w:val="FFFFFF"/>
-                <w:sz w:val="24"/>
-              </w:rPr>
-              <w:t>2</w:t>
-            </w:r>
-          </w:p>
-        </w:tc>
-        <w:tc>
-          <w:tcPr>
-            <w:tcW w:type="dxa" w:w="3685"/>
-            <w:shd w:fill="F3F5F6"/>
-            <w:vAlign w:val="center"/>
-          </w:tcPr>
-          <w:p>
-            <w:r>
-              <w:rPr>
-                <w:rFonts w:ascii="Aptos" w:hAnsi="Aptos" w:eastAsia="Aptos"/>
-                <w:b w:val="0"/>
-                <w:sz w:val="23"/>
-              </w:rPr>
-              <w:t>Anrede</w:t>
-            </w:r>
-          </w:p>
-        </w:tc>
-      </w:tr>
-      <w:tr>
-        <w:tc>
-          <w:tcPr>
-            <w:tcW w:type="dxa" w:w="3685"/>
-            <w:shd w:fill="3E5668"/>
-            <w:vAlign w:val="center"/>
-          </w:tcPr>
-          <w:p>
-            <w:r>
-              <w:rPr>
-                <w:rFonts w:ascii="Aptos" w:hAnsi="Aptos" w:eastAsia="Aptos"/>
-                <w:b/>
-                <w:color w:val="FFFFFF"/>
-                <w:sz w:val="24"/>
-              </w:rPr>
-              <w:t>3</w:t>
-            </w:r>
-          </w:p>
-        </w:tc>
-        <w:tc>
-          <w:tcPr>
-            <w:tcW w:type="dxa" w:w="3685"/>
-            <w:shd w:fill="F3F5F6"/>
-            <w:vAlign w:val="center"/>
-          </w:tcPr>
-          <w:p>
-            <w:r>
-              <w:rPr>
-                <w:rFonts w:ascii="Aptos" w:hAnsi="Aptos" w:eastAsia="Aptos"/>
-                <w:b/>
-                <w:color w:val="3E5668"/>
-                <w:sz w:val="23"/>
-              </w:rPr>
-              <w:t>Brieftext mit deinem Wunsch</w:t>
-            </w:r>
-          </w:p>
-        </w:tc>
-      </w:tr>
-      <w:tr>
-        <w:tc>
-          <w:tcPr>
-            <w:tcW w:type="dxa" w:w="3685"/>
-            <w:shd w:fill="3E5668"/>
-            <w:vAlign w:val="center"/>
-          </w:tcPr>
-          <w:p>
-            <w:r>
-              <w:rPr>
-                <w:rFonts w:ascii="Aptos" w:hAnsi="Aptos" w:eastAsia="Aptos"/>
-                <w:b/>
-                <w:color w:val="FFFFFF"/>
-                <w:sz w:val="24"/>
-              </w:rPr>
-              <w:t>4</w:t>
-            </w:r>
-          </w:p>
-        </w:tc>
-        <w:tc>
-          <w:tcPr>
-            <w:tcW w:type="dxa" w:w="3685"/>
-            <w:shd w:fill="F3F5F6"/>
-            <w:vAlign w:val="center"/>
-          </w:tcPr>
-          <w:p>
-            <w:r>
-              <w:rPr>
-                <w:rFonts w:ascii="Aptos" w:hAnsi="Aptos" w:eastAsia="Aptos"/>
-                <w:b w:val="0"/>
-                <w:sz w:val="23"/>
-              </w:rPr>
-              <w:t>Grußformel</w:t>
-            </w:r>
-          </w:p>
-        </w:tc>
-      </w:tr>
-      <w:tr>
-        <w:tc>
-          <w:tcPr>
-            <w:tcW w:type="dxa" w:w="3685"/>
-            <w:shd w:fill="3E5668"/>
-            <w:vAlign w:val="center"/>
-          </w:tcPr>
-          <w:p>
-            <w:r>
-              <w:rPr>
-                <w:rFonts w:ascii="Aptos" w:hAnsi="Aptos" w:eastAsia="Aptos"/>
-                <w:b/>
-                <w:color w:val="FFFFFF"/>
-                <w:sz w:val="24"/>
-              </w:rPr>
-              <w:t>5</w:t>
-            </w:r>
-          </w:p>
-        </w:tc>
-        <w:tc>
-          <w:tcPr>
-            <w:tcW w:type="dxa" w:w="3685"/>
-            <w:shd w:fill="F3F5F6"/>
-            <w:vAlign w:val="center"/>
-          </w:tcPr>
-          <w:p>
-            <w:r>
-              <w:rPr>
-                <w:rFonts w:ascii="Aptos" w:hAnsi="Aptos" w:eastAsia="Aptos"/>
-                <w:b w:val="0"/>
-                <w:sz w:val="23"/>
-              </w:rPr>
-              <w:t>Name</w:t>
-            </w:r>
-          </w:p>
-        </w:tc>
-      </w:tr>
-    </w:tbl>
     <w:p>
-      <w:pPr>
-        <w:spacing w:before="160" w:after="60"/>
-      </w:pPr>
       <w:r>
-        <w:rPr>
-          <w:rFonts w:ascii="Aptos" w:hAnsi="Aptos" w:eastAsia="Aptos"/>
-          <w:b/>
-          <w:color w:val="D97A4A"/>
-          <w:sz w:val="23"/>
-        </w:rPr>
-        <w:t>Beispiel</w:t>
+        <w:t>1  Ort und Datum</w:t>
+      </w:r>
+    </w:p>
+    <w:p>
+      <w:r>
+        <w:t>2  Anrede</w:t>
+      </w:r>
+    </w:p>
+    <w:p>
+      <w:r>
+        <w:t>3  Brieftext: Wunsch und weiterer Satz</w:t>
+      </w:r>
+    </w:p>
+    <w:p>
+      <w:r>
+        <w:t>4  Grußformel</w:t>
+      </w:r>
+    </w:p>
+    <w:p>
+      <w:r>
+        <w:t>5  Name</w:t>
       </w:r>
     </w:p>
     <w:p>
       <w:pPr>
-        <w:spacing w:before="0" w:after="40"/>
+        <w:shd w:fill="EEF2F4"/>
       </w:pPr>
       <w:r>
         <w:rPr>
-          <w:rFonts w:ascii="Aptos" w:hAnsi="Aptos" w:eastAsia="Aptos"/>
-          <w:b w:val="0"/>
-          <w:sz w:val="21"/>
+          <w:b/>
         </w:rPr>
+        <w:t>Beispiel</w:t>
+        <w:br/>
+      </w:r>
+      <w:r>
         <w:t>Dortmund, 15. September 2026</w:t>
+        <w:br/>
+        <w:t>Sehr geehrte Frau Berger,</w:t>
+        <w:br/>
+        <w:t>für unsere Klasse wünsche ich mir eine Leseecke. Ich würde mich darüber sehr freuen.</w:t>
+        <w:br/>
+        <w:t>Freundliche Grüße</w:t>
+        <w:br/>
+        <w:t>Mina</w:t>
+      </w:r>
+    </w:p>
+    <w:p>
+      <w:r>
+        <w:t>Nach der Anrede steht ein Komma. Nach der Grußformel steht kein Komma. Beginne jeden Briefteil in einer neuen Zeile.</w:t>
       </w:r>
     </w:p>
     <w:p>
       <w:pPr>
-        <w:spacing w:before="0" w:after="40"/>
+        <w:pStyle w:val="Title"/>
+        <w:pageBreakBefore/>
       </w:pPr>
       <w:r>
-        <w:rPr>
-          <w:rFonts w:ascii="Aptos" w:hAnsi="Aptos" w:eastAsia="Aptos"/>
-          <w:b w:val="0"/>
-          <w:sz w:val="21"/>
-        </w:rPr>
-        <w:t>Sehr geehrte Frau Berger,</w:t>
-      </w:r>
-    </w:p>
-    <w:p>
-      <w:pPr>
-        <w:spacing w:before="0" w:after="40"/>
-      </w:pPr>
-      <w:r>
-        <w:rPr>
-          <w:rFonts w:ascii="Aptos" w:hAnsi="Aptos" w:eastAsia="Aptos"/>
-          <w:b w:val="0"/>
-          <w:sz w:val="21"/>
-        </w:rPr>
-        <w:t>für unsere Klasse wünsche ich mir eine Leseecke. In unserer Umfrage haben sich 17 von 26 Kindern dafür entschieden.</w:t>
-      </w:r>
-    </w:p>
-    <w:p>
-      <w:pPr>
-        <w:spacing w:before="0" w:after="40"/>
-      </w:pPr>
-      <w:r>
-        <w:rPr>
-          <w:rFonts w:ascii="Aptos" w:hAnsi="Aptos" w:eastAsia="Aptos"/>
-          <w:b w:val="0"/>
-          <w:sz w:val="21"/>
-        </w:rPr>
-        <w:t>Freundliche Grüße</w:t>
-      </w:r>
-    </w:p>
-    <w:p>
-      <w:pPr>
-        <w:spacing w:before="0" w:after="40"/>
-      </w:pPr>
-      <w:r>
-        <w:rPr>
-          <w:rFonts w:ascii="Aptos" w:hAnsi="Aptos" w:eastAsia="Aptos"/>
-          <w:b w:val="0"/>
-          <w:sz w:val="21"/>
-        </w:rPr>
-        <w:t>Mina</w:t>
-      </w:r>
-    </w:p>
-    <w:p>
-      <w:pPr>
-        <w:sectPr>
-          <w:pgSz w:w="8391" w:h="11906"/>
-          <w:pgMar w:top="510" w:right="510" w:bottom="510" w:left="510" w:header="720" w:footer="720" w:gutter="0"/>
-          <w:cols w:space="720"/>
-          <w:docGrid w:linePitch="360"/>
-        </w:sectPr>
-      </w:pPr>
-    </w:p>
-    <w:p>
-      <w:pPr>
-        <w:spacing w:after="40"/>
-      </w:pPr>
-      <w:r>
-        <w:rPr>
-          <w:rFonts w:ascii="Aptos" w:hAnsi="Aptos" w:eastAsia="Aptos"/>
-          <w:b/>
-          <w:color w:val="D97A4A"/>
-          <w:sz w:val="21"/>
-        </w:rPr>
         <w:t>Merkblatt 3</w:t>
       </w:r>
     </w:p>
     <w:p>
       <w:pPr>
-        <w:spacing w:after="80"/>
+        <w:pStyle w:val="Heading1"/>
       </w:pPr>
       <w:r>
-        <w:rPr>
-          <w:rFonts w:ascii="Aptos" w:hAnsi="Aptos" w:eastAsia="Aptos"/>
-          <w:b/>
-          <w:color w:val="3E5668"/>
-          <w:sz w:val="36"/>
-        </w:rPr>
         <w:t>Wünsche freundlich formulieren</w:t>
       </w:r>
     </w:p>
     <w:p>
       <w:pPr>
-        <w:spacing w:before="0" w:after="140"/>
+        <w:shd w:fill="EEF2F4"/>
       </w:pPr>
       <w:r>
         <w:rPr>
-          <w:rFonts w:ascii="Aptos" w:hAnsi="Aptos" w:eastAsia="Aptos"/>
-          <w:b w:val="0"/>
-          <w:sz w:val="23"/>
+          <w:b/>
         </w:rPr>
-        <w:t>Dein Wunsch soll deutlich, freundlich und genau sein.</w:t>
+        <w:t>Das hilft dir:</w:t>
+        <w:br/>
       </w:r>
-    </w:p>
-    <w:tbl>
-      <w:tblPr>
-        <w:tblW w:type="auto" w:w="0"/>
-        <w:jc w:val="center"/>
-        <w:tblLayout w:type="autofit"/>
-        <w:tblLook w:firstColumn="1" w:firstRow="1" w:lastColumn="0" w:lastRow="0" w:noHBand="0" w:noVBand="1" w:val="04A0"/>
-      </w:tblPr>
-      <w:tblGrid>
-        <w:gridCol w:w="7371"/>
-      </w:tblGrid>
-      <w:tr>
-        <w:tc>
-          <w:tcPr>
-            <w:tcW w:type="dxa" w:w="7371"/>
-            <w:shd w:fill="F9EFE8"/>
-            <w:tcMar>
-              <w:top w:w="120" w:type="dxa"/>
-              <w:start w:w="130" w:type="dxa"/>
-              <w:bottom w:w="120" w:type="dxa"/>
-              <w:end w:w="130" w:type="dxa"/>
-            </w:tcMar>
-          </w:tcPr>
-          <w:p/>
-          <w:p>
-            <w:pPr>
-              <w:spacing w:before="0" w:after="60"/>
-            </w:pPr>
-            <w:r>
-              <w:rPr>
-                <w:rFonts w:ascii="Aptos" w:hAnsi="Aptos" w:eastAsia="Aptos"/>
-                <w:b/>
-                <w:color w:val="D97A4A"/>
-                <w:sz w:val="23"/>
-              </w:rPr>
-              <w:t>Passende Satzstarter</w:t>
-            </w:r>
-          </w:p>
-          <w:p>
-            <w:pPr>
-              <w:spacing w:before="0" w:after="40"/>
-              <w:ind w:left="198"/>
-            </w:pPr>
-            <w:r>
-              <w:rPr>
-                <w:rFonts w:ascii="Aptos" w:hAnsi="Aptos" w:eastAsia="Aptos"/>
-                <w:b w:val="0"/>
-                <w:sz w:val="21"/>
-              </w:rPr>
-              <w:t>• Ich wünsche mir …</w:t>
-            </w:r>
-          </w:p>
-          <w:p>
-            <w:pPr>
-              <w:spacing w:before="0" w:after="40"/>
-              <w:ind w:left="198"/>
-            </w:pPr>
-            <w:r>
-              <w:rPr>
-                <w:rFonts w:ascii="Aptos" w:hAnsi="Aptos" w:eastAsia="Aptos"/>
-                <w:b w:val="0"/>
-                <w:sz w:val="21"/>
-              </w:rPr>
-              <w:t>• Für unsere Klasse wünsche ich mir …</w:t>
-            </w:r>
-          </w:p>
-          <w:p>
-            <w:pPr>
-              <w:spacing w:before="0" w:after="40"/>
-              <w:ind w:left="198"/>
-            </w:pPr>
-            <w:r>
-              <w:rPr>
-                <w:rFonts w:ascii="Aptos" w:hAnsi="Aptos" w:eastAsia="Aptos"/>
-                <w:b w:val="0"/>
-                <w:sz w:val="21"/>
-              </w:rPr>
-              <w:t>• Ich würde mich freuen, wenn …</w:t>
-            </w:r>
-          </w:p>
-          <w:p>
-            <w:pPr>
-              <w:spacing w:before="0" w:after="40"/>
-              <w:ind w:left="198"/>
-            </w:pPr>
-            <w:r>
-              <w:rPr>
-                <w:rFonts w:ascii="Aptos" w:hAnsi="Aptos" w:eastAsia="Aptos"/>
-                <w:b w:val="0"/>
-                <w:sz w:val="21"/>
-              </w:rPr>
-              <w:t>• Könnten Sie bitte …</w:t>
-            </w:r>
-          </w:p>
-        </w:tc>
-      </w:tr>
-    </w:tbl>
-    <w:p>
-      <w:pPr>
-        <w:spacing w:after="0"/>
-      </w:pPr>
-    </w:p>
-    <w:tbl>
-      <w:tblPr>
-        <w:tblW w:type="auto" w:w="0"/>
-        <w:jc w:val="center"/>
-        <w:tblLayout w:type="autofit"/>
-        <w:tblLook w:firstColumn="1" w:firstRow="1" w:lastColumn="0" w:lastRow="0" w:noHBand="0" w:noVBand="1" w:val="04A0"/>
-      </w:tblPr>
-      <w:tblGrid>
-        <w:gridCol w:w="7371"/>
-      </w:tblGrid>
-      <w:tr>
-        <w:tc>
-          <w:tcPr>
-            <w:tcW w:type="dxa" w:w="7371"/>
-            <w:shd w:fill="EEEAF7"/>
-            <w:tcMar>
-              <w:top w:w="120" w:type="dxa"/>
-              <w:start w:w="130" w:type="dxa"/>
-              <w:bottom w:w="120" w:type="dxa"/>
-              <w:end w:w="130" w:type="dxa"/>
-            </w:tcMar>
-          </w:tcPr>
-          <w:p/>
-          <w:p>
-            <w:pPr>
-              <w:spacing w:before="0" w:after="60"/>
-            </w:pPr>
-            <w:r>
-              <w:rPr>
-                <w:rFonts w:ascii="Aptos" w:hAnsi="Aptos" w:eastAsia="Aptos"/>
-                <w:b/>
-                <w:color w:val="6E5B8F"/>
-                <w:sz w:val="23"/>
-              </w:rPr>
-              <w:t>Wenn du Daten nutzt</w:t>
-            </w:r>
-          </w:p>
-          <w:p>
-            <w:pPr>
-              <w:spacing w:before="0" w:after="40"/>
-              <w:ind w:left="198"/>
-            </w:pPr>
-            <w:r>
-              <w:rPr>
-                <w:rFonts w:ascii="Aptos" w:hAnsi="Aptos" w:eastAsia="Aptos"/>
-                <w:b w:val="0"/>
-                <w:sz w:val="21"/>
-              </w:rPr>
-              <w:t>• In unserer Umfrage haben sich … Kinder … gewünscht.</w:t>
-            </w:r>
-          </w:p>
-          <w:p>
-            <w:pPr>
-              <w:spacing w:before="0" w:after="40"/>
-              <w:ind w:left="198"/>
-            </w:pPr>
-            <w:r>
-              <w:rPr>
-                <w:rFonts w:ascii="Aptos" w:hAnsi="Aptos" w:eastAsia="Aptos"/>
-                <w:b w:val="0"/>
-                <w:sz w:val="21"/>
-              </w:rPr>
-              <w:t>• … von … Kindern wünschen sich …</w:t>
-            </w:r>
-          </w:p>
-          <w:p>
-            <w:pPr>
-              <w:spacing w:before="0" w:after="40"/>
-              <w:ind w:left="198"/>
-            </w:pPr>
-            <w:r>
-              <w:rPr>
-                <w:rFonts w:ascii="Aptos" w:hAnsi="Aptos" w:eastAsia="Aptos"/>
-                <w:b w:val="0"/>
-                <w:sz w:val="21"/>
-              </w:rPr>
-              <w:t>• Das Diagramm zeigt, dass …</w:t>
-            </w:r>
-          </w:p>
-          <w:p>
-            <w:pPr>
-              <w:spacing w:before="0" w:after="40"/>
-              <w:ind w:left="198"/>
-            </w:pPr>
-            <w:r>
-              <w:rPr>
-                <w:rFonts w:ascii="Aptos" w:hAnsi="Aptos" w:eastAsia="Aptos"/>
-                <w:b w:val="0"/>
-                <w:sz w:val="21"/>
-              </w:rPr>
-              <w:t>• Besonders viele Kinder wünschen sich …</w:t>
-            </w:r>
-          </w:p>
-        </w:tc>
-      </w:tr>
-    </w:tbl>
-    <w:p>
-      <w:pPr>
-        <w:spacing w:after="0"/>
-      </w:pPr>
-    </w:p>
-    <w:p>
-      <w:pPr>
-        <w:spacing w:before="40" w:after="60"/>
-      </w:pPr>
       <w:r>
-        <w:rPr>
-          <w:rFonts w:ascii="Aptos" w:hAnsi="Aptos" w:eastAsia="Aptos"/>
-          <w:b/>
-          <w:color w:val="3E5668"/>
-          <w:sz w:val="23"/>
-        </w:rPr>
-        <w:t>Genau statt unklar</w:t>
+        <w:t>Du schreibst freundlich und genau.</w:t>
       </w:r>
     </w:p>
     <w:p>
       <w:pPr>
-        <w:spacing w:before="0" w:after="80"/>
+        <w:pStyle w:val="Heading2"/>
       </w:pPr>
       <w:r>
-        <w:rPr>
-          <w:rFonts w:ascii="Aptos" w:hAnsi="Aptos" w:eastAsia="Aptos"/>
-          <w:b w:val="0"/>
-          <w:sz w:val="21"/>
-        </w:rPr>
-        <w:t>Ungenau: Fast alle wollen neue Spiele.</w:t>
+        <w:t>Wähle einen passenden Anfang:</w:t>
+      </w:r>
+    </w:p>
+    <w:p>
+      <w:r>
+        <w:t>Ich wünsche mir …</w:t>
+      </w:r>
+    </w:p>
+    <w:p>
+      <w:r>
+        <w:t>Für unsere Klasse wünsche ich mir …</w:t>
+      </w:r>
+    </w:p>
+    <w:p>
+      <w:r>
+        <w:t>Ich würde mich freuen, wenn …</w:t>
+      </w:r>
+    </w:p>
+    <w:p>
+      <w:r>
+        <w:t>Könnten Sie bitte …?</w:t>
       </w:r>
     </w:p>
     <w:p>
       <w:pPr>
-        <w:spacing w:before="0" w:after="80"/>
+        <w:shd w:fill="EEF2F4"/>
       </w:pPr>
       <w:r>
         <w:rPr>
-          <w:rFonts w:ascii="Aptos" w:hAnsi="Aptos" w:eastAsia="Aptos"/>
           <w:b/>
-          <w:color w:val="7DBB6F"/>
-          <w:sz w:val="21"/>
         </w:rPr>
-        <w:t>Genau: 18 von 26 Kindern wünschen sich eine Spieleausleihe.</w:t>
+        <w:t>Freundlich und genau</w:t>
+        <w:br/>
+      </w:r>
+      <w:r>
+        <w:t>Statt: „Geben Sie uns mehr Sachen!“</w:t>
+        <w:br/>
+        <w:t>Schreibe: „Ich wünsche mir neue Bälle für die Pause.“</w:t>
       </w:r>
     </w:p>
     <w:p>
       <w:pPr>
-        <w:sectPr>
-          <w:pgSz w:w="8391" w:h="11906"/>
-          <w:pgMar w:top="510" w:right="510" w:bottom="510" w:left="510" w:header="720" w:footer="720" w:gutter="0"/>
-          <w:cols w:space="720"/>
-          <w:docGrid w:linePitch="360"/>
-        </w:sectPr>
+        <w:pStyle w:val="Heading2"/>
       </w:pPr>
+      <w:r>
+        <w:t>Ein weiterer passender Satz</w:t>
+      </w:r>
+    </w:p>
+    <w:p>
+      <w:r>
+        <w:t>Du kannst sagen, was du erhoffst oder wie du die Sache nutzen möchtest.</w:t>
+      </w:r>
     </w:p>
     <w:p>
       <w:pPr>
-        <w:spacing w:after="40"/>
+        <w:shd w:fill="EEF2F4"/>
       </w:pPr>
       <w:r>
         <w:rPr>
-          <w:rFonts w:ascii="Aptos" w:hAnsi="Aptos" w:eastAsia="Aptos"/>
           <w:b/>
-          <w:color w:val="D97A4A"/>
-          <w:sz w:val="21"/>
         </w:rPr>
+        <w:t>Beispiele</w:t>
+        <w:br/>
+      </w:r>
+      <w:r>
+        <w:t>Ich würde mich darüber sehr freuen.</w:t>
+        <w:br/>
+        <w:t>Die Bälle könnten wir in der Pause nutzen.</w:t>
+      </w:r>
+    </w:p>
+    <w:p>
+      <w:r>
+        <w:t>Schreibe „Sie“ groß, wenn du eine erwachsene Person höflich ansprichst.</w:t>
+      </w:r>
+    </w:p>
+    <w:p>
+      <w:pPr>
+        <w:pStyle w:val="Title"/>
+        <w:pageBreakBefore/>
+      </w:pPr>
+      <w:r>
         <w:t>Merkblatt 4</w:t>
       </w:r>
     </w:p>
     <w:p>
       <w:pPr>
-        <w:spacing w:after="80"/>
+        <w:pStyle w:val="Heading1"/>
       </w:pPr>
       <w:r>
-        <w:rPr>
-          <w:rFonts w:ascii="Aptos" w:hAnsi="Aptos" w:eastAsia="Aptos"/>
-          <w:b/>
-          <w:color w:val="3E5668"/>
-          <w:sz w:val="36"/>
-        </w:rPr>
         <w:t>Einen Wunsch begründen</w:t>
       </w:r>
     </w:p>
     <w:p>
       <w:pPr>
-        <w:spacing w:before="0" w:after="140"/>
+        <w:shd w:fill="EEF2F4"/>
       </w:pPr>
       <w:r>
         <w:rPr>
-          <w:rFonts w:ascii="Aptos" w:hAnsi="Aptos" w:eastAsia="Aptos"/>
-          <w:b w:val="0"/>
-          <w:sz w:val="23"/>
+          <w:b/>
         </w:rPr>
-        <w:t>Ein guter Grund erklärt, warum dein Wunsch sinnvoll ist.</w:t>
+        <w:t>Das hilft dir:</w:t>
+        <w:br/>
       </w:r>
-    </w:p>
-    <w:tbl>
-      <w:tblPr>
-        <w:tblW w:type="auto" w:w="0"/>
-        <w:jc w:val="center"/>
-        <w:tblLayout w:type="autofit"/>
-        <w:tblLook w:firstColumn="1" w:firstRow="1" w:lastColumn="0" w:lastRow="0" w:noHBand="0" w:noVBand="1" w:val="04A0"/>
-      </w:tblPr>
-      <w:tblGrid>
-        <w:gridCol w:w="7371"/>
-      </w:tblGrid>
-      <w:tr>
-        <w:tc>
-          <w:tcPr>
-            <w:tcW w:type="dxa" w:w="7371"/>
-            <w:shd w:fill="EEF6EA"/>
-            <w:tcMar>
-              <w:top w:w="120" w:type="dxa"/>
-              <w:start w:w="130" w:type="dxa"/>
-              <w:bottom w:w="120" w:type="dxa"/>
-              <w:end w:w="130" w:type="dxa"/>
-            </w:tcMar>
-          </w:tcPr>
-          <w:p/>
-          <w:p>
-            <w:pPr>
-              <w:spacing w:before="0" w:after="60"/>
-            </w:pPr>
-            <w:r>
-              <w:rPr>
-                <w:rFonts w:ascii="Aptos" w:hAnsi="Aptos" w:eastAsia="Aptos"/>
-                <w:b/>
-                <w:color w:val="4D8B3F"/>
-                <w:sz w:val="23"/>
-              </w:rPr>
-              <w:t>Satzverbindungen</w:t>
-            </w:r>
-          </w:p>
-          <w:p>
-            <w:pPr>
-              <w:spacing w:before="0" w:after="40"/>
-              <w:ind w:left="198"/>
-            </w:pPr>
-            <w:r>
-              <w:rPr>
-                <w:rFonts w:ascii="Aptos" w:hAnsi="Aptos" w:eastAsia="Aptos"/>
-                <w:b w:val="0"/>
-                <w:sz w:val="21"/>
-              </w:rPr>
-              <w:t>• weil</w:t>
-            </w:r>
-          </w:p>
-          <w:p>
-            <w:pPr>
-              <w:spacing w:before="0" w:after="40"/>
-              <w:ind w:left="198"/>
-            </w:pPr>
-            <w:r>
-              <w:rPr>
-                <w:rFonts w:ascii="Aptos" w:hAnsi="Aptos" w:eastAsia="Aptos"/>
-                <w:b w:val="0"/>
-                <w:sz w:val="21"/>
-              </w:rPr>
-              <w:t>• denn</w:t>
-            </w:r>
-          </w:p>
-          <w:p>
-            <w:pPr>
-              <w:spacing w:before="0" w:after="40"/>
-              <w:ind w:left="198"/>
-            </w:pPr>
-            <w:r>
-              <w:rPr>
-                <w:rFonts w:ascii="Aptos" w:hAnsi="Aptos" w:eastAsia="Aptos"/>
-                <w:b w:val="0"/>
-                <w:sz w:val="21"/>
-              </w:rPr>
-              <w:t>• deshalb</w:t>
-            </w:r>
-          </w:p>
-          <w:p>
-            <w:pPr>
-              <w:spacing w:before="0" w:after="40"/>
-              <w:ind w:left="198"/>
-            </w:pPr>
-            <w:r>
-              <w:rPr>
-                <w:rFonts w:ascii="Aptos" w:hAnsi="Aptos" w:eastAsia="Aptos"/>
-                <w:b w:val="0"/>
-                <w:sz w:val="21"/>
-              </w:rPr>
-              <w:t>• dadurch</w:t>
-            </w:r>
-          </w:p>
-          <w:p>
-            <w:pPr>
-              <w:spacing w:before="0" w:after="40"/>
-              <w:ind w:left="198"/>
-            </w:pPr>
-            <w:r>
-              <w:rPr>
-                <w:rFonts w:ascii="Aptos" w:hAnsi="Aptos" w:eastAsia="Aptos"/>
-                <w:b w:val="0"/>
-                <w:sz w:val="21"/>
-              </w:rPr>
-              <w:t>• außerdem</w:t>
-            </w:r>
-          </w:p>
-          <w:p>
-            <w:pPr>
-              <w:spacing w:before="0" w:after="40"/>
-              <w:ind w:left="198"/>
-            </w:pPr>
-            <w:r>
-              <w:rPr>
-                <w:rFonts w:ascii="Aptos" w:hAnsi="Aptos" w:eastAsia="Aptos"/>
-                <w:b w:val="0"/>
-                <w:sz w:val="21"/>
-              </w:rPr>
-              <w:t>• so können wir …</w:t>
-            </w:r>
-          </w:p>
-        </w:tc>
-      </w:tr>
-    </w:tbl>
-    <w:p>
-      <w:pPr>
-        <w:spacing w:after="0"/>
-      </w:pPr>
-    </w:p>
-    <w:p>
-      <w:pPr>
-        <w:spacing w:before="40" w:after="80"/>
-      </w:pPr>
       <w:r>
-        <w:rPr>
-          <w:rFonts w:ascii="Aptos" w:hAnsi="Aptos" w:eastAsia="Aptos"/>
-          <w:b/>
-          <w:color w:val="3E5668"/>
-          <w:sz w:val="23"/>
-        </w:rPr>
-        <w:t>Zwei Arten von Gründen</w:t>
+        <w:t>Du erklärst einen Nutzen. Diese Vertiefung ist freiwillig.</w:t>
       </w:r>
     </w:p>
     <w:p>
       <w:pPr>
-        <w:spacing w:before="0" w:after="20"/>
+        <w:shd w:fill="EEF2F4"/>
       </w:pPr>
       <w:r>
         <w:rPr>
-          <w:rFonts w:ascii="Aptos" w:hAnsi="Aptos" w:eastAsia="Aptos"/>
           <w:b/>
-          <w:color w:val="D97A4A"/>
-          <w:sz w:val="21"/>
         </w:rPr>
-        <w:t>Sachlicher Grund:</w:t>
+        <w:t>Ein Grund erklärt den Nutzen</w:t>
+        <w:br/>
+      </w:r>
+      <w:r>
+        <w:t>Eine Spieleausleihe wäre sinnvoll, weil wir dann gemeinsam spielen können.</w:t>
       </w:r>
     </w:p>
     <w:p>
       <w:pPr>
-        <w:spacing w:before="0" w:after="80"/>
+        <w:pStyle w:val="Heading2"/>
       </w:pPr>
       <w:r>
-        <w:rPr>
-          <w:rFonts w:ascii="Aptos" w:hAnsi="Aptos" w:eastAsia="Aptos"/>
-          <w:b w:val="0"/>
-          <w:sz w:val="21"/>
-        </w:rPr>
-        <w:t>Eine Spieleausleihe wäre sinnvoll, weil Kinder dann gemeinsam spielen können.</w:t>
+        <w:t>So kannst du beginnen:</w:t>
+      </w:r>
+    </w:p>
+    <w:p>
+      <w:r>
+        <w:t>Das wäre sinnvoll, weil …</w:t>
+        <w:br/>
+        <w:t>Das hilft uns, denn …</w:t>
+        <w:br/>
+        <w:t>Dadurch können wir …</w:t>
+      </w:r>
+    </w:p>
+    <w:p>
+      <w:r>
+        <w:t>„Weil ich das will“ erklärt den Nutzen noch nicht. Frage dich: Was wird durch den Wunsch besser?</w:t>
       </w:r>
     </w:p>
     <w:p>
       <w:pPr>
-        <w:spacing w:before="0" w:after="20"/>
+        <w:shd w:fill="EEF2F4"/>
       </w:pPr>
       <w:r>
         <w:rPr>
-          <w:rFonts w:ascii="Aptos" w:hAnsi="Aptos" w:eastAsia="Aptos"/>
           <w:b/>
-          <w:color w:val="6E5B8F"/>
-          <w:sz w:val="21"/>
         </w:rPr>
-        <w:t>Umfrageergebnis als zusätzliches Argument:</w:t>
+        <w:t>Zahlen · ebenfalls freiwillig</w:t>
+        <w:br/>
+      </w:r>
+      <w:r>
+        <w:t>18 von 26 Kindern wünschen sich eine Spieleausleihe.</w:t>
+        <w:br/>
+        <w:t>Das ist ein Umfrageergebnis. Die Zahl allein erklärt noch keinen sachlichen Nutzen.</w:t>
+      </w:r>
+    </w:p>
+    <w:p>
+      <w:r>
+        <w:t>Übernimm Zahl und Wunsch genau. Schreibe nicht „alle“, wenn es 18 von 26 sind. Nutze nur Daten, die zu deinem Wunsch passen.</w:t>
+      </w:r>
+    </w:p>
+    <w:p>
+      <w:r>
+        <w:t>Ohne Grund und Zahlen kann dein Grundtext vollständig sein.</w:t>
       </w:r>
     </w:p>
     <w:p>
       <w:pPr>
-        <w:spacing w:before="0" w:after="100"/>
+        <w:pStyle w:val="Title"/>
+        <w:pageBreakBefore/>
       </w:pPr>
       <w:r>
-        <w:rPr>
-          <w:rFonts w:ascii="Aptos" w:hAnsi="Aptos" w:eastAsia="Aptos"/>
-          <w:b w:val="0"/>
-          <w:sz w:val="21"/>
-        </w:rPr>
-        <w:t>Außerdem haben sich 18 von 26 Kindern eine Spieleausleihe gewünscht.</w:t>
-      </w:r>
-    </w:p>
-    <w:tbl>
-      <w:tblPr>
-        <w:tblW w:type="auto" w:w="0"/>
-        <w:jc w:val="center"/>
-        <w:tblLayout w:type="autofit"/>
-        <w:tblLook w:firstColumn="1" w:firstRow="1" w:lastColumn="0" w:lastRow="0" w:noHBand="0" w:noVBand="1" w:val="04A0"/>
-      </w:tblPr>
-      <w:tblGrid>
-        <w:gridCol w:w="7371"/>
-      </w:tblGrid>
-      <w:tr>
-        <w:tc>
-          <w:tcPr>
-            <w:tcW w:type="dxa" w:w="7371"/>
-            <w:shd w:fill="FBF5E2"/>
-            <w:tcMar>
-              <w:top w:w="120" w:type="dxa"/>
-              <w:start w:w="130" w:type="dxa"/>
-              <w:bottom w:w="120" w:type="dxa"/>
-              <w:end w:w="130" w:type="dxa"/>
-            </w:tcMar>
-          </w:tcPr>
-          <w:p/>
-          <w:p>
-            <w:pPr>
-              <w:spacing w:before="0" w:after="60"/>
-            </w:pPr>
-            <w:r>
-              <w:rPr>
-                <w:rFonts w:ascii="Aptos" w:hAnsi="Aptos" w:eastAsia="Aptos"/>
-                <w:b/>
-                <w:color w:val="C17B00"/>
-                <w:sz w:val="23"/>
-              </w:rPr>
-              <w:t>Wichtig</w:t>
-            </w:r>
-          </w:p>
-          <w:p>
-            <w:pPr>
-              <w:spacing w:before="0" w:after="40"/>
-              <w:ind w:left="198"/>
-            </w:pPr>
-            <w:r>
-              <w:rPr>
-                <w:rFonts w:ascii="Aptos" w:hAnsi="Aptos" w:eastAsia="Aptos"/>
-                <w:b w:val="0"/>
-                <w:sz w:val="21"/>
-              </w:rPr>
-              <w:t>• Die Zahl ersetzt nicht automatisch einen sachlichen Grund.</w:t>
-            </w:r>
-          </w:p>
-          <w:p>
-            <w:pPr>
-              <w:spacing w:before="0" w:after="40"/>
-              <w:ind w:left="198"/>
-            </w:pPr>
-            <w:r>
-              <w:rPr>
-                <w:rFonts w:ascii="Aptos" w:hAnsi="Aptos" w:eastAsia="Aptos"/>
-                <w:b w:val="0"/>
-                <w:sz w:val="21"/>
-              </w:rPr>
-              <w:t>• Übernimm Zahlen genau.</w:t>
-            </w:r>
-          </w:p>
-          <w:p>
-            <w:pPr>
-              <w:spacing w:before="0" w:after="40"/>
-              <w:ind w:left="198"/>
-            </w:pPr>
-            <w:r>
-              <w:rPr>
-                <w:rFonts w:ascii="Aptos" w:hAnsi="Aptos" w:eastAsia="Aptos"/>
-                <w:b w:val="0"/>
-                <w:sz w:val="21"/>
-              </w:rPr>
-              <w:t>• Schreibe nicht „alle“, wenn es nicht alle sind.</w:t>
-            </w:r>
-          </w:p>
-        </w:tc>
-      </w:tr>
-    </w:tbl>
-    <w:p>
-      <w:pPr>
-        <w:spacing w:after="0"/>
-      </w:pPr>
-    </w:p>
-    <w:p>
-      <w:pPr>
-        <w:sectPr>
-          <w:pgSz w:w="8391" w:h="11906"/>
-          <w:pgMar w:top="510" w:right="510" w:bottom="510" w:left="510" w:header="720" w:footer="720" w:gutter="0"/>
-          <w:cols w:space="720"/>
-          <w:docGrid w:linePitch="360"/>
-        </w:sectPr>
-      </w:pPr>
-    </w:p>
-    <w:p>
-      <w:pPr>
-        <w:spacing w:after="40"/>
-      </w:pPr>
-      <w:r>
-        <w:rPr>
-          <w:rFonts w:ascii="Aptos" w:hAnsi="Aptos" w:eastAsia="Aptos"/>
-          <w:b/>
-          <w:color w:val="D97A4A"/>
-          <w:sz w:val="21"/>
-        </w:rPr>
         <w:t>Merkblatt 5</w:t>
       </w:r>
     </w:p>
     <w:p>
       <w:pPr>
-        <w:spacing w:after="80"/>
+        <w:pStyle w:val="Heading1"/>
       </w:pPr>
       <w:r>
-        <w:rPr>
-          <w:rFonts w:ascii="Aptos" w:hAnsi="Aptos" w:eastAsia="Aptos"/>
-          <w:b/>
-          <w:color w:val="3E5668"/>
-          <w:sz w:val="36"/>
-        </w:rPr>
         <w:t>Einen Brief planen und schreiben</w:t>
       </w:r>
     </w:p>
     <w:p>
       <w:pPr>
-        <w:spacing w:before="0" w:after="140"/>
+        <w:shd w:fill="EEF2F4"/>
       </w:pPr>
       <w:r>
         <w:rPr>
-          <w:rFonts w:ascii="Aptos" w:hAnsi="Aptos" w:eastAsia="Aptos"/>
-          <w:b w:val="0"/>
-          <w:sz w:val="23"/>
+          <w:b/>
         </w:rPr>
-        <w:t>Du nutzt den Schreibprozess und die SRL-Phasen.</w:t>
+        <w:t>Das hilft dir:</w:t>
+        <w:br/>
       </w:r>
-    </w:p>
-    <w:tbl>
-      <w:tblPr>
-        <w:tblW w:type="auto" w:w="0"/>
-        <w:jc w:val="center"/>
-        <w:tblLayout w:type="autofit"/>
-        <w:tblLook w:firstColumn="1" w:firstRow="1" w:lastColumn="0" w:lastRow="0" w:noHBand="0" w:noVBand="1" w:val="04A0"/>
-      </w:tblPr>
-      <w:tblGrid>
-        <w:gridCol w:w="7371"/>
-      </w:tblGrid>
-      <w:tr>
-        <w:tc>
-          <w:tcPr>
-            <w:tcW w:type="dxa" w:w="7371"/>
-            <w:shd w:fill="F3F5F6"/>
-            <w:tcMar>
-              <w:top w:w="120" w:type="dxa"/>
-              <w:start w:w="130" w:type="dxa"/>
-              <w:bottom w:w="120" w:type="dxa"/>
-              <w:end w:w="130" w:type="dxa"/>
-            </w:tcMar>
-          </w:tcPr>
-          <w:p/>
-          <w:p>
-            <w:pPr>
-              <w:spacing w:before="0" w:after="60"/>
-            </w:pPr>
-            <w:r>
-              <w:rPr>
-                <w:rFonts w:ascii="Aptos" w:hAnsi="Aptos" w:eastAsia="Aptos"/>
-                <w:b/>
-                <w:color w:val="3E5668"/>
-                <w:sz w:val="23"/>
-              </w:rPr>
-              <w:t>Planung</w:t>
-            </w:r>
-          </w:p>
-          <w:p>
-            <w:pPr>
-              <w:spacing w:before="0" w:after="40"/>
-              <w:ind w:left="198"/>
-            </w:pPr>
-            <w:r>
-              <w:rPr>
-                <w:rFonts w:ascii="Aptos" w:hAnsi="Aptos" w:eastAsia="Aptos"/>
-                <w:b w:val="0"/>
-                <w:sz w:val="21"/>
-              </w:rPr>
-              <w:t>• Schreibauftrag lesen</w:t>
-            </w:r>
-          </w:p>
-          <w:p>
-            <w:pPr>
-              <w:spacing w:before="0" w:after="40"/>
-              <w:ind w:left="198"/>
-            </w:pPr>
-            <w:r>
-              <w:rPr>
-                <w:rFonts w:ascii="Aptos" w:hAnsi="Aptos" w:eastAsia="Aptos"/>
-                <w:b w:val="0"/>
-                <w:sz w:val="21"/>
-              </w:rPr>
-              <w:t>• Empfänger und Wunsch festlegen</w:t>
-            </w:r>
-          </w:p>
-          <w:p>
-            <w:pPr>
-              <w:spacing w:before="0" w:after="40"/>
-              <w:ind w:left="198"/>
-            </w:pPr>
-            <w:r>
-              <w:rPr>
-                <w:rFonts w:ascii="Aptos" w:hAnsi="Aptos" w:eastAsia="Aptos"/>
-                <w:b w:val="0"/>
-                <w:sz w:val="21"/>
-              </w:rPr>
-              <w:t>• Stichwörter notieren</w:t>
-            </w:r>
-          </w:p>
-          <w:p>
-            <w:pPr>
-              <w:spacing w:before="0" w:after="40"/>
-              <w:ind w:left="198"/>
-            </w:pPr>
-            <w:r>
-              <w:rPr>
-                <w:rFonts w:ascii="Aptos" w:hAnsi="Aptos" w:eastAsia="Aptos"/>
-                <w:b w:val="0"/>
-                <w:sz w:val="21"/>
-              </w:rPr>
-              <w:t>• passendes Umfrageergebnis auswählen</w:t>
-            </w:r>
-          </w:p>
-        </w:tc>
-      </w:tr>
-    </w:tbl>
-    <w:p>
-      <w:pPr>
-        <w:spacing w:after="0"/>
-      </w:pPr>
-    </w:p>
-    <w:tbl>
-      <w:tblPr>
-        <w:tblW w:type="auto" w:w="0"/>
-        <w:jc w:val="center"/>
-        <w:tblLayout w:type="autofit"/>
-        <w:tblLook w:firstColumn="1" w:firstRow="1" w:lastColumn="0" w:lastRow="0" w:noHBand="0" w:noVBand="1" w:val="04A0"/>
-      </w:tblPr>
-      <w:tblGrid>
-        <w:gridCol w:w="7371"/>
-      </w:tblGrid>
-      <w:tr>
-        <w:tc>
-          <w:tcPr>
-            <w:tcW w:type="dxa" w:w="7371"/>
-            <w:shd w:fill="F3F5F6"/>
-            <w:tcMar>
-              <w:top w:w="120" w:type="dxa"/>
-              <w:start w:w="130" w:type="dxa"/>
-              <w:bottom w:w="120" w:type="dxa"/>
-              <w:end w:w="130" w:type="dxa"/>
-            </w:tcMar>
-          </w:tcPr>
-          <w:p/>
-          <w:p>
-            <w:pPr>
-              <w:spacing w:before="0" w:after="60"/>
-            </w:pPr>
-            <w:r>
-              <w:rPr>
-                <w:rFonts w:ascii="Aptos" w:hAnsi="Aptos" w:eastAsia="Aptos"/>
-                <w:b/>
-                <w:color w:val="D97A4A"/>
-                <w:sz w:val="23"/>
-              </w:rPr>
-              <w:t>Durchführung</w:t>
-            </w:r>
-          </w:p>
-          <w:p>
-            <w:pPr>
-              <w:spacing w:before="0" w:after="40"/>
-              <w:ind w:left="198"/>
-            </w:pPr>
-            <w:r>
-              <w:rPr>
-                <w:rFonts w:ascii="Aptos" w:hAnsi="Aptos" w:eastAsia="Aptos"/>
-                <w:b w:val="0"/>
-                <w:sz w:val="21"/>
-              </w:rPr>
-              <w:t>• Brief in vollständigen Sätzen schreiben</w:t>
-            </w:r>
-          </w:p>
-          <w:p>
-            <w:pPr>
-              <w:spacing w:before="0" w:after="40"/>
-              <w:ind w:left="198"/>
-            </w:pPr>
-            <w:r>
-              <w:rPr>
-                <w:rFonts w:ascii="Aptos" w:hAnsi="Aptos" w:eastAsia="Aptos"/>
-                <w:b w:val="0"/>
-                <w:sz w:val="21"/>
-              </w:rPr>
-              <w:t>• Satzstarter und Merkblätter nutzen</w:t>
-            </w:r>
-          </w:p>
-          <w:p>
-            <w:pPr>
-              <w:spacing w:before="0" w:after="40"/>
-              <w:ind w:left="198"/>
-            </w:pPr>
-            <w:r>
-              <w:rPr>
-                <w:rFonts w:ascii="Aptos" w:hAnsi="Aptos" w:eastAsia="Aptos"/>
-                <w:b w:val="0"/>
-                <w:sz w:val="21"/>
-              </w:rPr>
-              <w:t>• Zahlen richtig in Worte fassen</w:t>
-            </w:r>
-          </w:p>
-        </w:tc>
-      </w:tr>
-    </w:tbl>
-    <w:p>
-      <w:pPr>
-        <w:spacing w:after="0"/>
-      </w:pPr>
-    </w:p>
-    <w:tbl>
-      <w:tblPr>
-        <w:tblW w:type="auto" w:w="0"/>
-        <w:jc w:val="center"/>
-        <w:tblLayout w:type="autofit"/>
-        <w:tblLook w:firstColumn="1" w:firstRow="1" w:lastColumn="0" w:lastRow="0" w:noHBand="0" w:noVBand="1" w:val="04A0"/>
-      </w:tblPr>
-      <w:tblGrid>
-        <w:gridCol w:w="7371"/>
-      </w:tblGrid>
-      <w:tr>
-        <w:tc>
-          <w:tcPr>
-            <w:tcW w:type="dxa" w:w="7371"/>
-            <w:shd w:fill="F3F5F6"/>
-            <w:tcMar>
-              <w:top w:w="120" w:type="dxa"/>
-              <w:start w:w="130" w:type="dxa"/>
-              <w:bottom w:w="120" w:type="dxa"/>
-              <w:end w:w="130" w:type="dxa"/>
-            </w:tcMar>
-          </w:tcPr>
-          <w:p/>
-          <w:p>
-            <w:pPr>
-              <w:spacing w:before="0" w:after="60"/>
-            </w:pPr>
-            <w:r>
-              <w:rPr>
-                <w:rFonts w:ascii="Aptos" w:hAnsi="Aptos" w:eastAsia="Aptos"/>
-                <w:b/>
-                <w:color w:val="7DBB6F"/>
-                <w:sz w:val="23"/>
-              </w:rPr>
-              <w:t>Reflexion</w:t>
-            </w:r>
-          </w:p>
-          <w:p>
-            <w:pPr>
-              <w:spacing w:before="0" w:after="40"/>
-              <w:ind w:left="198"/>
-            </w:pPr>
-            <w:r>
-              <w:rPr>
-                <w:rFonts w:ascii="Aptos" w:hAnsi="Aptos" w:eastAsia="Aptos"/>
-                <w:b w:val="0"/>
-                <w:sz w:val="21"/>
-              </w:rPr>
-              <w:t>• Brief mit der Checkliste prüfen</w:t>
-            </w:r>
-          </w:p>
-          <w:p>
-            <w:pPr>
-              <w:spacing w:before="0" w:after="40"/>
-              <w:ind w:left="198"/>
-            </w:pPr>
-            <w:r>
-              <w:rPr>
-                <w:rFonts w:ascii="Aptos" w:hAnsi="Aptos" w:eastAsia="Aptos"/>
-                <w:b w:val="0"/>
-                <w:sz w:val="21"/>
-              </w:rPr>
-              <w:t>• mindestens eine Stelle verbessern</w:t>
-            </w:r>
-          </w:p>
-          <w:p>
-            <w:pPr>
-              <w:spacing w:before="0" w:after="40"/>
-              <w:ind w:left="198"/>
-            </w:pPr>
-            <w:r>
-              <w:rPr>
-                <w:rFonts w:ascii="Aptos" w:hAnsi="Aptos" w:eastAsia="Aptos"/>
-                <w:b w:val="0"/>
-                <w:sz w:val="21"/>
-              </w:rPr>
-              <w:t>• nächsten Lernschritt festhalten</w:t>
-            </w:r>
-          </w:p>
-        </w:tc>
-      </w:tr>
-    </w:tbl>
-    <w:p>
-      <w:pPr>
-        <w:spacing w:after="0"/>
-      </w:pPr>
+      <w:r>
+        <w:t>Du gehst Schritt für Schritt vor.</w:t>
+      </w:r>
     </w:p>
     <w:p>
       <w:pPr>
-        <w:sectPr>
-          <w:pgSz w:w="8391" w:h="11906"/>
-          <w:pgMar w:top="510" w:right="510" w:bottom="510" w:left="510" w:header="720" w:footer="720" w:gutter="0"/>
-          <w:cols w:space="720"/>
-          <w:docGrid w:linePitch="360"/>
-        </w:sectPr>
+        <w:pStyle w:val="Heading1"/>
       </w:pPr>
+      <w:r>
+        <w:t>Planung</w:t>
+      </w:r>
+    </w:p>
+    <w:p>
+      <w:r>
+        <w:t>Lies den Auftrag. Wähle Person und Wunsch. Plane einen weiteren passenden Satz. Notiere Stichwörter mit Blatt 16.</w:t>
+      </w:r>
     </w:p>
     <w:p>
       <w:pPr>
-        <w:spacing w:after="40"/>
+        <w:pStyle w:val="Heading1"/>
+      </w:pPr>
+      <w:r>
+        <w:t>Durchführung</w:t>
+      </w:r>
+    </w:p>
+    <w:p>
+      <w:r>
+        <w:t>Schreibe ganze Sätze. Nutze alle fünf Briefteile von Merkblatt 2. Blatt 17 hilft dir bei Bedarf mit Satzanfängen.</w:t>
+      </w:r>
+    </w:p>
+    <w:p>
+      <w:pPr>
+        <w:pStyle w:val="Heading1"/>
+      </w:pPr>
+      <w:r>
+        <w:t>Reflexion</w:t>
+      </w:r>
+    </w:p>
+    <w:p>
+      <w:r>
+        <w:t>Prüfe mit Merkblatt 6 oder Blatt 19. Verbessere nur, was noch fehlt oder unklar ist. Ein passender Text darf so bleiben.</w:t>
+      </w:r>
+    </w:p>
+    <w:p>
+      <w:pPr>
+        <w:shd w:fill="EEF2F4"/>
       </w:pPr>
       <w:r>
         <w:rPr>
-          <w:rFonts w:ascii="Aptos" w:hAnsi="Aptos" w:eastAsia="Aptos"/>
           <w:b/>
-          <w:color w:val="D97A4A"/>
-          <w:sz w:val="21"/>
         </w:rPr>
+        <w:t>Zusatz · freiwillig</w:t>
+        <w:br/>
+      </w:r>
+      <w:r>
+        <w:t>Du kannst einen Grund oder passende Daten ergänzen. Prüfe dann auch, ob diese stimmen.</w:t>
+      </w:r>
+    </w:p>
+    <w:p>
+      <w:r>
+        <w:t>Besprich mit der Lehrkraft, was schon gelingt und welche Übung dir als Nächstes hilft.</w:t>
+      </w:r>
+    </w:p>
+    <w:p>
+      <w:pPr>
+        <w:pStyle w:val="Title"/>
+        <w:pageBreakBefore/>
+      </w:pPr>
+      <w:r>
         <w:t>Merkblatt 6</w:t>
       </w:r>
     </w:p>
     <w:p>
       <w:pPr>
-        <w:spacing w:after="80"/>
+        <w:pStyle w:val="Heading1"/>
       </w:pPr>
       <w:r>
-        <w:rPr>
-          <w:rFonts w:ascii="Aptos" w:hAnsi="Aptos" w:eastAsia="Aptos"/>
-          <w:b/>
-          <w:color w:val="3E5668"/>
-          <w:sz w:val="36"/>
-        </w:rPr>
-        <w:t>Checkliste für meinen Wunschbrief</w:t>
+        <w:t>Checkliste für deinen Wunschbrief</w:t>
       </w:r>
     </w:p>
     <w:p>
       <w:pPr>
-        <w:spacing w:before="0" w:after="140"/>
+        <w:shd w:fill="EEF2F4"/>
       </w:pPr>
       <w:r>
         <w:rPr>
-          <w:rFonts w:ascii="Aptos" w:hAnsi="Aptos" w:eastAsia="Aptos"/>
-          <w:b w:val="0"/>
-          <w:sz w:val="23"/>
+          <w:b/>
         </w:rPr>
-        <w:t>Prüfe deinen Brief Punkt für Punkt.</w:t>
+        <w:t>Das hilft dir:</w:t>
+        <w:br/>
+      </w:r>
+      <w:r>
+        <w:t>Du prüfst deinen Brief an konkreten Stellen.</w:t>
+      </w:r>
+    </w:p>
+    <w:p>
+      <w:r>
+        <w:t>☐ Ort und Datum stehen oben.</w:t>
+      </w:r>
+    </w:p>
+    <w:p>
+      <w:r>
+        <w:t>☐ Die Anrede passt zur Person.</w:t>
+      </w:r>
+    </w:p>
+    <w:p>
+      <w:r>
+        <w:t>☐ Dein Wunsch ist klar und passt zur Aufgabe.</w:t>
+      </w:r>
+    </w:p>
+    <w:p>
+      <w:r>
+        <w:t>☐ Mindestens ein weiterer Satz passt dazu.</w:t>
+      </w:r>
+    </w:p>
+    <w:p>
+      <w:r>
+        <w:t>☐ Dein Brief klingt freundlich.</w:t>
+      </w:r>
+    </w:p>
+    <w:p>
+      <w:r>
+        <w:t>☐ Grußformel und Name stehen am Ende.</w:t>
+      </w:r>
+    </w:p>
+    <w:p>
+      <w:r>
+        <w:t>☐ Du schreibst verständliche ganze Sätze.</w:t>
+      </w:r>
+    </w:p>
+    <w:p>
+      <w:r>
+        <w:t>☐ Deine Schrift ist lesbar.</w:t>
+      </w:r>
+    </w:p>
+    <w:p>
+      <w:r>
+        <w:t>Hake erst ab, wenn du die passende Stelle gefunden hast. Lies für Sprache und Lesbarkeit den ganzen Brief.</w:t>
       </w:r>
     </w:p>
     <w:p>
       <w:pPr>
-        <w:spacing w:before="0" w:after="80"/>
+        <w:shd w:fill="EEF2F4"/>
       </w:pPr>
       <w:r>
         <w:rPr>
-          <w:rFonts w:ascii="Aptos" w:hAnsi="Aptos" w:eastAsia="Aptos"/>
-          <w:b w:val="0"/>
-          <w:sz w:val="22"/>
+          <w:b/>
         </w:rPr>
-        <w:t>☐ Ich habe eine passende Anrede.</w:t>
+        <w:t>Nur wenn du Zusätze nutzt</w:t>
+        <w:br/>
+      </w:r>
+      <w:r>
+        <w:t>Passt dein Grund zum Wunsch?</w:t>
+        <w:br/>
+        <w:t>Stimmen die Zahlen und der Wunsch aus der Umfrage?</w:t>
+      </w:r>
+    </w:p>
+    <w:p>
+      <w:r>
+        <w:t>Verbessere nur, was nötig ist. Der Kompetenzcheck hilft dir bei der Wahl deiner nächsten Übung.</w:t>
       </w:r>
     </w:p>
     <w:p>
       <w:pPr>
-        <w:spacing w:before="0" w:after="80"/>
+        <w:pStyle w:val="Title"/>
+        <w:pageBreakBefore/>
       </w:pPr>
       <w:r>
-        <w:rPr>
-          <w:rFonts w:ascii="Aptos" w:hAnsi="Aptos" w:eastAsia="Aptos"/>
-          <w:b w:val="0"/>
-          <w:sz w:val="22"/>
-        </w:rPr>
-        <w:t>☐ Mein Wunsch ist klar und freundlich.</w:t>
-      </w:r>
-    </w:p>
-    <w:p>
-      <w:pPr>
-        <w:spacing w:before="0" w:after="80"/>
-      </w:pPr>
-      <w:r>
-        <w:rPr>
-          <w:rFonts w:ascii="Aptos" w:hAnsi="Aptos" w:eastAsia="Aptos"/>
-          <w:b w:val="0"/>
-          <w:sz w:val="22"/>
-        </w:rPr>
-        <w:t>☐ Ich habe vollständige Sätze geschrieben.</w:t>
-      </w:r>
-    </w:p>
-    <w:p>
-      <w:pPr>
-        <w:spacing w:before="0" w:after="80"/>
-      </w:pPr>
-      <w:r>
-        <w:rPr>
-          <w:rFonts w:ascii="Aptos" w:hAnsi="Aptos" w:eastAsia="Aptos"/>
-          <w:b w:val="0"/>
-          <w:sz w:val="22"/>
-        </w:rPr>
-        <w:t>☐ Ich habe eine passende Grußformel und meinen Namen.</w:t>
-      </w:r>
-    </w:p>
-    <w:p>
-      <w:pPr>
-        <w:spacing w:before="0" w:after="80"/>
-      </w:pPr>
-      <w:r>
-        <w:rPr>
-          <w:rFonts w:ascii="Aptos" w:hAnsi="Aptos" w:eastAsia="Aptos"/>
-          <w:b w:val="0"/>
-          <w:sz w:val="22"/>
-        </w:rPr>
-        <w:t>☐ Mein Brief ist gut lesbar.</w:t>
-      </w:r>
-    </w:p>
-    <w:tbl>
-      <w:tblPr>
-        <w:tblW w:type="auto" w:w="0"/>
-        <w:jc w:val="center"/>
-        <w:tblLayout w:type="autofit"/>
-        <w:tblLook w:firstColumn="1" w:firstRow="1" w:lastColumn="0" w:lastRow="0" w:noHBand="0" w:noVBand="1" w:val="04A0"/>
-      </w:tblPr>
-      <w:tblGrid>
-        <w:gridCol w:w="7371"/>
-      </w:tblGrid>
-      <w:tr>
-        <w:tc>
-          <w:tcPr>
-            <w:tcW w:type="dxa" w:w="7371"/>
-            <w:shd w:fill="EEEAF7"/>
-            <w:tcMar>
-              <w:top w:w="120" w:type="dxa"/>
-              <w:start w:w="130" w:type="dxa"/>
-              <w:bottom w:w="120" w:type="dxa"/>
-              <w:end w:w="130" w:type="dxa"/>
-            </w:tcMar>
-          </w:tcPr>
-          <w:p/>
-          <w:p>
-            <w:pPr>
-              <w:spacing w:before="0" w:after="60"/>
-            </w:pPr>
-            <w:r>
-              <w:rPr>
-                <w:rFonts w:ascii="Aptos" w:hAnsi="Aptos" w:eastAsia="Aptos"/>
-                <w:b/>
-                <w:color w:val="6E5B8F"/>
-                <w:sz w:val="23"/>
-              </w:rPr>
-              <w:t>Wenn ich Umfragedaten nutze</w:t>
-            </w:r>
-          </w:p>
-          <w:p>
-            <w:pPr>
-              <w:spacing w:before="0" w:after="40"/>
-              <w:ind w:left="198"/>
-            </w:pPr>
-            <w:r>
-              <w:rPr>
-                <w:rFonts w:ascii="Aptos" w:hAnsi="Aptos" w:eastAsia="Aptos"/>
-                <w:b w:val="0"/>
-                <w:sz w:val="21"/>
-              </w:rPr>
-              <w:t>• Ich habe die Zahl richtig übernommen.</w:t>
-            </w:r>
-          </w:p>
-          <w:p>
-            <w:pPr>
-              <w:spacing w:before="0" w:after="40"/>
-              <w:ind w:left="198"/>
-            </w:pPr>
-            <w:r>
-              <w:rPr>
-                <w:rFonts w:ascii="Aptos" w:hAnsi="Aptos" w:eastAsia="Aptos"/>
-                <w:b w:val="0"/>
-                <w:sz w:val="21"/>
-              </w:rPr>
-              <w:t>• Mein Satz erklärt verständlich, was die Zahl bedeutet.</w:t>
-            </w:r>
-          </w:p>
-          <w:p>
-            <w:pPr>
-              <w:spacing w:before="0" w:after="40"/>
-              <w:ind w:left="198"/>
-            </w:pPr>
-            <w:r>
-              <w:rPr>
-                <w:rFonts w:ascii="Aptos" w:hAnsi="Aptos" w:eastAsia="Aptos"/>
-                <w:b w:val="0"/>
-                <w:sz w:val="21"/>
-              </w:rPr>
-              <w:t>• Die Daten passen wirklich zu meinem Wunsch.</w:t>
-            </w:r>
-          </w:p>
-        </w:tc>
-      </w:tr>
-    </w:tbl>
-    <w:p>
-      <w:pPr>
-        <w:spacing w:after="0"/>
-      </w:pPr>
-    </w:p>
-    <w:p>
-      <w:pPr>
-        <w:sectPr>
-          <w:pgSz w:w="8391" w:h="11906"/>
-          <w:pgMar w:top="510" w:right="510" w:bottom="510" w:left="510" w:header="720" w:footer="720" w:gutter="0"/>
-          <w:cols w:space="720"/>
-          <w:docGrid w:linePitch="360"/>
-        </w:sectPr>
-      </w:pPr>
-    </w:p>
-    <w:p>
-      <w:pPr>
-        <w:spacing w:after="40"/>
-      </w:pPr>
-      <w:r>
-        <w:rPr>
-          <w:rFonts w:ascii="Aptos" w:hAnsi="Aptos" w:eastAsia="Aptos"/>
-          <w:b/>
-          <w:color w:val="D97A4A"/>
-          <w:sz w:val="21"/>
-        </w:rPr>
         <w:t>Merkblatt 7</w:t>
       </w:r>
     </w:p>
     <w:p>
       <w:pPr>
-        <w:spacing w:after="80"/>
+        <w:pStyle w:val="Heading1"/>
       </w:pPr>
       <w:r>
-        <w:rPr>
-          <w:rFonts w:ascii="Aptos" w:hAnsi="Aptos" w:eastAsia="Aptos"/>
-          <w:b/>
-          <w:color w:val="3E5668"/>
-          <w:sz w:val="36"/>
-        </w:rPr>
-        <w:t>So arbeite ich in der Lernzeit</w:t>
+        <w:t>So arbeitest du in der Lernzeit</w:t>
       </w:r>
     </w:p>
     <w:p>
       <w:pPr>
-        <w:spacing w:before="0" w:after="140"/>
+        <w:shd w:fill="EEF2F4"/>
       </w:pPr>
       <w:r>
         <w:rPr>
-          <w:rFonts w:ascii="Aptos" w:hAnsi="Aptos" w:eastAsia="Aptos"/>
-          <w:b w:val="0"/>
-          <w:sz w:val="23"/>
+          <w:b/>
         </w:rPr>
-        <w:t>Planung – Durchführung – Reflexion</w:t>
+        <w:t>Das hilft dir:</w:t>
+        <w:br/>
       </w:r>
-    </w:p>
-    <w:tbl>
-      <w:tblPr>
-        <w:tblW w:type="auto" w:w="0"/>
-        <w:jc w:val="center"/>
-        <w:tblLayout w:type="autofit"/>
-        <w:tblLook w:firstColumn="1" w:firstRow="1" w:lastColumn="0" w:lastRow="0" w:noHBand="0" w:noVBand="1" w:val="04A0"/>
-      </w:tblPr>
-      <w:tblGrid>
-        <w:gridCol w:w="7371"/>
-      </w:tblGrid>
-      <w:tr>
-        <w:tc>
-          <w:tcPr>
-            <w:tcW w:type="dxa" w:w="7371"/>
-            <w:shd w:fill="F3F5F6"/>
-            <w:tcMar>
-              <w:top w:w="120" w:type="dxa"/>
-              <w:start w:w="130" w:type="dxa"/>
-              <w:bottom w:w="120" w:type="dxa"/>
-              <w:end w:w="130" w:type="dxa"/>
-            </w:tcMar>
-          </w:tcPr>
-          <w:p/>
-          <w:p>
-            <w:pPr>
-              <w:spacing w:before="0" w:after="60"/>
-            </w:pPr>
-            <w:r>
-              <w:rPr>
-                <w:rFonts w:ascii="Aptos" w:hAnsi="Aptos" w:eastAsia="Aptos"/>
-                <w:b/>
-                <w:color w:val="3E5668"/>
-                <w:sz w:val="23"/>
-              </w:rPr>
-              <w:t>Planung</w:t>
-            </w:r>
-          </w:p>
-          <w:p>
-            <w:pPr>
-              <w:spacing w:before="0" w:after="40"/>
-              <w:ind w:left="198"/>
-            </w:pPr>
-            <w:r>
-              <w:rPr>
-                <w:rFonts w:ascii="Aptos" w:hAnsi="Aptos" w:eastAsia="Aptos"/>
-                <w:b w:val="0"/>
-                <w:sz w:val="21"/>
-              </w:rPr>
-              <w:t>• Ich schaue mir meine Aufgaben an.</w:t>
-            </w:r>
-          </w:p>
-          <w:p>
-            <w:pPr>
-              <w:spacing w:before="0" w:after="40"/>
-              <w:ind w:left="198"/>
-            </w:pPr>
-            <w:r>
-              <w:rPr>
-                <w:rFonts w:ascii="Aptos" w:hAnsi="Aptos" w:eastAsia="Aptos"/>
-                <w:b w:val="0"/>
-                <w:sz w:val="21"/>
-              </w:rPr>
-              <w:t>• Ich setze mir ein kleines Ziel.</w:t>
-            </w:r>
-          </w:p>
-          <w:p>
-            <w:pPr>
-              <w:spacing w:before="0" w:after="40"/>
-              <w:ind w:left="198"/>
-            </w:pPr>
-            <w:r>
-              <w:rPr>
-                <w:rFonts w:ascii="Aptos" w:hAnsi="Aptos" w:eastAsia="Aptos"/>
-                <w:b w:val="0"/>
-                <w:sz w:val="21"/>
-              </w:rPr>
-              <w:t>• Ich lege Material und Hilfen bereit.</w:t>
-            </w:r>
-          </w:p>
-        </w:tc>
-      </w:tr>
-    </w:tbl>
-    <w:p>
-      <w:pPr>
-        <w:spacing w:after="0"/>
-      </w:pPr>
-    </w:p>
-    <w:tbl>
-      <w:tblPr>
-        <w:tblW w:type="auto" w:w="0"/>
-        <w:jc w:val="center"/>
-        <w:tblLayout w:type="autofit"/>
-        <w:tblLook w:firstColumn="1" w:firstRow="1" w:lastColumn="0" w:lastRow="0" w:noHBand="0" w:noVBand="1" w:val="04A0"/>
-      </w:tblPr>
-      <w:tblGrid>
-        <w:gridCol w:w="7371"/>
-      </w:tblGrid>
-      <w:tr>
-        <w:tc>
-          <w:tcPr>
-            <w:tcW w:type="dxa" w:w="7371"/>
-            <w:shd w:fill="F3F5F6"/>
-            <w:tcMar>
-              <w:top w:w="120" w:type="dxa"/>
-              <w:start w:w="130" w:type="dxa"/>
-              <w:bottom w:w="120" w:type="dxa"/>
-              <w:end w:w="130" w:type="dxa"/>
-            </w:tcMar>
-          </w:tcPr>
-          <w:p/>
-          <w:p>
-            <w:pPr>
-              <w:spacing w:before="0" w:after="60"/>
-            </w:pPr>
-            <w:r>
-              <w:rPr>
-                <w:rFonts w:ascii="Aptos" w:hAnsi="Aptos" w:eastAsia="Aptos"/>
-                <w:b/>
-                <w:color w:val="D97A4A"/>
-                <w:sz w:val="23"/>
-              </w:rPr>
-              <w:t>Durchführung</w:t>
-            </w:r>
-          </w:p>
-          <w:p>
-            <w:pPr>
-              <w:spacing w:before="0" w:after="40"/>
-              <w:ind w:left="198"/>
-            </w:pPr>
-            <w:r>
-              <w:rPr>
-                <w:rFonts w:ascii="Aptos" w:hAnsi="Aptos" w:eastAsia="Aptos"/>
-                <w:b w:val="0"/>
-                <w:sz w:val="21"/>
-              </w:rPr>
-              <w:t>• Ich arbeite Schritt für Schritt.</w:t>
-            </w:r>
-          </w:p>
-          <w:p>
-            <w:pPr>
-              <w:spacing w:before="0" w:after="40"/>
-              <w:ind w:left="198"/>
-            </w:pPr>
-            <w:r>
-              <w:rPr>
-                <w:rFonts w:ascii="Aptos" w:hAnsi="Aptos" w:eastAsia="Aptos"/>
-                <w:b w:val="0"/>
-                <w:sz w:val="21"/>
-              </w:rPr>
-              <w:t>• Ich nutze eine passende Strategie.</w:t>
-            </w:r>
-          </w:p>
-          <w:p>
-            <w:pPr>
-              <w:spacing w:before="0" w:after="40"/>
-              <w:ind w:left="198"/>
-            </w:pPr>
-            <w:r>
-              <w:rPr>
-                <w:rFonts w:ascii="Aptos" w:hAnsi="Aptos" w:eastAsia="Aptos"/>
-                <w:b w:val="0"/>
-                <w:sz w:val="21"/>
-              </w:rPr>
-              <w:t>• Ich prüfe zwischendurch meinen Fortschritt.</w:t>
-            </w:r>
-          </w:p>
-        </w:tc>
-      </w:tr>
-    </w:tbl>
-    <w:p>
-      <w:pPr>
-        <w:spacing w:after="0"/>
-      </w:pPr>
-    </w:p>
-    <w:tbl>
-      <w:tblPr>
-        <w:tblW w:type="auto" w:w="0"/>
-        <w:jc w:val="center"/>
-        <w:tblLayout w:type="autofit"/>
-        <w:tblLook w:firstColumn="1" w:firstRow="1" w:lastColumn="0" w:lastRow="0" w:noHBand="0" w:noVBand="1" w:val="04A0"/>
-      </w:tblPr>
-      <w:tblGrid>
-        <w:gridCol w:w="7371"/>
-      </w:tblGrid>
-      <w:tr>
-        <w:tc>
-          <w:tcPr>
-            <w:tcW w:type="dxa" w:w="7371"/>
-            <w:shd w:fill="F3F5F6"/>
-            <w:tcMar>
-              <w:top w:w="120" w:type="dxa"/>
-              <w:start w:w="130" w:type="dxa"/>
-              <w:bottom w:w="120" w:type="dxa"/>
-              <w:end w:w="130" w:type="dxa"/>
-            </w:tcMar>
-          </w:tcPr>
-          <w:p/>
-          <w:p>
-            <w:pPr>
-              <w:spacing w:before="0" w:after="60"/>
-            </w:pPr>
-            <w:r>
-              <w:rPr>
-                <w:rFonts w:ascii="Aptos" w:hAnsi="Aptos" w:eastAsia="Aptos"/>
-                <w:b/>
-                <w:color w:val="7DBB6F"/>
-                <w:sz w:val="23"/>
-              </w:rPr>
-              <w:t>Reflexion</w:t>
-            </w:r>
-          </w:p>
-          <w:p>
-            <w:pPr>
-              <w:spacing w:before="0" w:after="40"/>
-              <w:ind w:left="198"/>
-            </w:pPr>
-            <w:r>
-              <w:rPr>
-                <w:rFonts w:ascii="Aptos" w:hAnsi="Aptos" w:eastAsia="Aptos"/>
-                <w:b w:val="0"/>
-                <w:sz w:val="21"/>
-              </w:rPr>
-              <w:t>• Ich prüfe, was ich geschafft habe.</w:t>
-            </w:r>
-          </w:p>
-          <w:p>
-            <w:pPr>
-              <w:spacing w:before="0" w:after="40"/>
-              <w:ind w:left="198"/>
-            </w:pPr>
-            <w:r>
-              <w:rPr>
-                <w:rFonts w:ascii="Aptos" w:hAnsi="Aptos" w:eastAsia="Aptos"/>
-                <w:b w:val="0"/>
-                <w:sz w:val="21"/>
-              </w:rPr>
-              <w:t>• Ich benenne, was mir geholfen hat.</w:t>
-            </w:r>
-          </w:p>
-          <w:p>
-            <w:pPr>
-              <w:spacing w:before="0" w:after="40"/>
-              <w:ind w:left="198"/>
-            </w:pPr>
-            <w:r>
-              <w:rPr>
-                <w:rFonts w:ascii="Aptos" w:hAnsi="Aptos" w:eastAsia="Aptos"/>
-                <w:b w:val="0"/>
-                <w:sz w:val="21"/>
-              </w:rPr>
-              <w:t>• Ich lege meinen nächsten Schritt fest.</w:t>
-            </w:r>
-          </w:p>
-        </w:tc>
-      </w:tr>
-    </w:tbl>
-    <w:p>
-      <w:pPr>
-        <w:spacing w:after="0"/>
-      </w:pPr>
+      <w:r>
+        <w:t>Du nutzt Planung, Durchführung und Reflexion.</w:t>
+      </w:r>
     </w:p>
     <w:p>
       <w:pPr>
-        <w:sectPr>
-          <w:pgSz w:w="8391" w:h="11906"/>
-          <w:pgMar w:top="510" w:right="510" w:bottom="510" w:left="510" w:header="720" w:footer="720" w:gutter="0"/>
-          <w:cols w:space="720"/>
-          <w:docGrid w:linePitch="360"/>
-        </w:sectPr>
+        <w:pStyle w:val="Heading1"/>
       </w:pPr>
+      <w:r>
+        <w:t>Planung</w:t>
+      </w:r>
+    </w:p>
+    <w:p>
+      <w:r>
+        <w:t>Schau auf deinen Papierlernweg. Wähle ein kleines Ziel und dein nächstes Blatt. Lege Heft, Stift und Hilfen bereit.</w:t>
+      </w:r>
     </w:p>
     <w:p>
       <w:pPr>
-        <w:spacing w:after="40"/>
+        <w:pStyle w:val="Heading1"/>
+      </w:pPr>
+      <w:r>
+        <w:t>Durchführung</w:t>
+      </w:r>
+    </w:p>
+    <w:p>
+      <w:r>
+        <w:t>Bearbeite eine Aufgabe nach der anderen. Der Auftrag sagt dir: auf dem Blatt, im Heft oder mündlich. Nutze Hilfe, wenn du sie brauchst.</w:t>
+      </w:r>
+    </w:p>
+    <w:p>
+      <w:pPr>
+        <w:pStyle w:val="Heading1"/>
+      </w:pPr>
+      <w:r>
+        <w:t>Reflexion</w:t>
+      </w:r>
+    </w:p>
+    <w:p>
+      <w:r>
+        <w:t>Nutze „Prüfe“ auf deinem Blatt. Zeige, was gelungen ist. Hake die bearbeitete und geprüfte Aufgabe im Lernweg ab.</w:t>
+      </w:r>
+    </w:p>
+    <w:p>
+      <w:pPr>
+        <w:shd w:fill="EEF2F4"/>
       </w:pPr>
       <w:r>
         <w:rPr>
-          <w:rFonts w:ascii="Aptos" w:hAnsi="Aptos" w:eastAsia="Aptos"/>
           <w:b/>
-          <w:color w:val="D97A4A"/>
-          <w:sz w:val="21"/>
         </w:rPr>
+        <w:t>Dein nächster Schritt</w:t>
+        <w:br/>
+      </w:r>
+      <w:r>
+        <w:t>Was kannst du schon?</w:t>
+        <w:br/>
+        <w:t>Was möchtest du noch üben?</w:t>
+        <w:br/>
+        <w:t>Wähle eine passende nächste Aufgabe.</w:t>
+      </w:r>
+    </w:p>
+    <w:p>
+      <w:r>
+        <w:t>Du musst nicht schnell sein. Viele Haken zeigen erledigte Aufgaben. Dein Ergebnis zeigt, was du kannst.</w:t>
+      </w:r>
+    </w:p>
+    <w:p>
+      <w:pPr>
+        <w:pStyle w:val="Title"/>
+        <w:pageBreakBefore/>
+      </w:pPr>
+      <w:r>
         <w:t>Merkblatt 8</w:t>
       </w:r>
     </w:p>
     <w:p>
       <w:pPr>
-        <w:spacing w:after="80"/>
+        <w:pStyle w:val="Heading1"/>
       </w:pPr>
       <w:r>
-        <w:rPr>
-          <w:rFonts w:ascii="Aptos" w:hAnsi="Aptos" w:eastAsia="Aptos"/>
-          <w:b/>
-          <w:color w:val="3E5668"/>
-          <w:sz w:val="36"/>
-        </w:rPr>
-        <w:t>Meine Hilfekette</w:t>
+        <w:t>Deine Hilfekette</w:t>
       </w:r>
     </w:p>
     <w:p>
       <w:pPr>
-        <w:spacing w:before="0" w:after="140"/>
+        <w:shd w:fill="EEF2F4"/>
       </w:pPr>
       <w:r>
         <w:rPr>
-          <w:rFonts w:ascii="Aptos" w:hAnsi="Aptos" w:eastAsia="Aptos"/>
-          <w:b w:val="0"/>
-          <w:sz w:val="23"/>
+          <w:b/>
         </w:rPr>
-        <w:t>Wenn du nicht weiterkommst, gehst du die Schritte der Reihe nach.</w:t>
+        <w:t>Das hilft dir:</w:t>
+        <w:br/>
+      </w:r>
+      <w:r>
+        <w:t>Du findest Hilfe, wenn du feststeckst.</w:t>
       </w:r>
     </w:p>
-    <w:tbl>
-      <w:tblPr>
-        <w:tblW w:type="auto" w:w="0"/>
-        <w:jc w:val="center"/>
-        <w:tblLook w:firstColumn="1" w:firstRow="1" w:lastColumn="0" w:lastRow="0" w:noHBand="0" w:noVBand="1" w:val="04A0"/>
-      </w:tblPr>
-      <w:tblGrid>
-        <w:gridCol w:w="3685"/>
-        <w:gridCol w:w="3685"/>
-      </w:tblGrid>
-      <w:tr>
-        <w:tc>
-          <w:tcPr>
-            <w:tcW w:type="dxa" w:w="3685"/>
-            <w:shd w:fill="D97A4A"/>
-          </w:tcPr>
-          <w:p>
-            <w:r>
-              <w:rPr>
-                <w:rFonts w:ascii="Aptos" w:hAnsi="Aptos" w:eastAsia="Aptos"/>
-                <w:b/>
-                <w:color w:val="FFFFFF"/>
-                <w:sz w:val="24"/>
-              </w:rPr>
-              <w:t>1</w:t>
-            </w:r>
-          </w:p>
-        </w:tc>
-        <w:tc>
-          <w:tcPr>
-            <w:tcW w:type="dxa" w:w="3685"/>
-            <w:shd w:fill="F7F7F5"/>
-          </w:tcPr>
-          <w:p>
-            <w:r>
-              <w:rPr>
-                <w:rFonts w:ascii="Aptos" w:hAnsi="Aptos" w:eastAsia="Aptos"/>
-                <w:b w:val="0"/>
-                <w:sz w:val="22"/>
-              </w:rPr>
-              <w:t>Ich lese den Auftrag noch einmal.</w:t>
-            </w:r>
-          </w:p>
-        </w:tc>
-      </w:tr>
-      <w:tr>
-        <w:tc>
-          <w:tcPr>
-            <w:tcW w:type="dxa" w:w="3685"/>
-            <w:shd w:fill="D97A4A"/>
-          </w:tcPr>
-          <w:p>
-            <w:r>
-              <w:rPr>
-                <w:rFonts w:ascii="Aptos" w:hAnsi="Aptos" w:eastAsia="Aptos"/>
-                <w:b/>
-                <w:color w:val="FFFFFF"/>
-                <w:sz w:val="24"/>
-              </w:rPr>
-              <w:t>2</w:t>
-            </w:r>
-          </w:p>
-        </w:tc>
-        <w:tc>
-          <w:tcPr>
-            <w:tcW w:type="dxa" w:w="3685"/>
-            <w:shd w:fill="F7F7F5"/>
-          </w:tcPr>
-          <w:p>
-            <w:r>
-              <w:rPr>
-                <w:rFonts w:ascii="Aptos" w:hAnsi="Aptos" w:eastAsia="Aptos"/>
-                <w:b w:val="0"/>
-                <w:sz w:val="22"/>
-              </w:rPr>
-              <w:t>Ich schaue mir das Beispiel an.</w:t>
-            </w:r>
-          </w:p>
-        </w:tc>
-      </w:tr>
-      <w:tr>
-        <w:tc>
-          <w:tcPr>
-            <w:tcW w:type="dxa" w:w="3685"/>
-            <w:shd w:fill="D97A4A"/>
-          </w:tcPr>
-          <w:p>
-            <w:r>
-              <w:rPr>
-                <w:rFonts w:ascii="Aptos" w:hAnsi="Aptos" w:eastAsia="Aptos"/>
-                <w:b/>
-                <w:color w:val="FFFFFF"/>
-                <w:sz w:val="24"/>
-              </w:rPr>
-              <w:t>3</w:t>
-            </w:r>
-          </w:p>
-        </w:tc>
-        <w:tc>
-          <w:tcPr>
-            <w:tcW w:type="dxa" w:w="3685"/>
-            <w:shd w:fill="F7F7F5"/>
-          </w:tcPr>
-          <w:p>
-            <w:r>
-              <w:rPr>
-                <w:rFonts w:ascii="Aptos" w:hAnsi="Aptos" w:eastAsia="Aptos"/>
-                <w:b w:val="0"/>
-                <w:sz w:val="22"/>
-              </w:rPr>
-              <w:t>Ich nutze ein Merkblatt oder eine Hilfekarte.</w:t>
-            </w:r>
-          </w:p>
-        </w:tc>
-      </w:tr>
-      <w:tr>
-        <w:tc>
-          <w:tcPr>
-            <w:tcW w:type="dxa" w:w="3685"/>
-            <w:shd w:fill="D97A4A"/>
-          </w:tcPr>
-          <w:p>
-            <w:r>
-              <w:rPr>
-                <w:rFonts w:ascii="Aptos" w:hAnsi="Aptos" w:eastAsia="Aptos"/>
-                <w:b/>
-                <w:color w:val="FFFFFF"/>
-                <w:sz w:val="24"/>
-              </w:rPr>
-              <w:t>4</w:t>
-            </w:r>
-          </w:p>
-        </w:tc>
-        <w:tc>
-          <w:tcPr>
-            <w:tcW w:type="dxa" w:w="3685"/>
-            <w:shd w:fill="F7F7F5"/>
-          </w:tcPr>
-          <w:p>
-            <w:r>
-              <w:rPr>
-                <w:rFonts w:ascii="Aptos" w:hAnsi="Aptos" w:eastAsia="Aptos"/>
-                <w:b w:val="0"/>
-                <w:sz w:val="22"/>
-              </w:rPr>
-              <w:t>Ich frage ein Partnerkind.</w:t>
-            </w:r>
-          </w:p>
-        </w:tc>
-      </w:tr>
-      <w:tr>
-        <w:tc>
-          <w:tcPr>
-            <w:tcW w:type="dxa" w:w="3685"/>
-            <w:shd w:fill="3E5668"/>
-          </w:tcPr>
-          <w:p>
-            <w:r>
-              <w:rPr>
-                <w:rFonts w:ascii="Aptos" w:hAnsi="Aptos" w:eastAsia="Aptos"/>
-                <w:b/>
-                <w:color w:val="FFFFFF"/>
-                <w:sz w:val="24"/>
-              </w:rPr>
-              <w:t>5</w:t>
-            </w:r>
-          </w:p>
-        </w:tc>
-        <w:tc>
-          <w:tcPr>
-            <w:tcW w:type="dxa" w:w="3685"/>
-            <w:shd w:fill="F7F7F5"/>
-          </w:tcPr>
-          <w:p>
-            <w:r>
-              <w:rPr>
-                <w:rFonts w:ascii="Aptos" w:hAnsi="Aptos" w:eastAsia="Aptos"/>
-                <w:b w:val="0"/>
-                <w:sz w:val="22"/>
-              </w:rPr>
-              <w:t>Ich frage die Lehrkraft.</w:t>
-            </w:r>
-          </w:p>
-        </w:tc>
-      </w:tr>
-    </w:tbl>
     <w:p>
       <w:pPr>
-        <w:spacing w:before="160" w:after="80"/>
+        <w:pStyle w:val="Heading2"/>
+      </w:pPr>
+      <w:r>
+        <w:t>Lies den Auftrag noch einmal.</w:t>
+      </w:r>
+    </w:p>
+    <w:p>
+      <w:r>
+        <w:t>Schau auf die Hilfe und das Beispiel auf deinem Blatt.</w:t>
+      </w:r>
+    </w:p>
+    <w:p>
+      <w:pPr>
+        <w:pStyle w:val="Heading2"/>
+      </w:pPr>
+      <w:r>
+        <w:t>Wähle eine passende Papierhilfe:</w:t>
+      </w:r>
+    </w:p>
+    <w:p>
+      <w:r>
+        <w:t>Wunsch oder Person? → Merkblatt 1</w:t>
+      </w:r>
+    </w:p>
+    <w:p>
+      <w:r>
+        <w:t>Briefteile? → Merkblatt 2</w:t>
+      </w:r>
+    </w:p>
+    <w:p>
+      <w:r>
+        <w:t>Freundliche Sätze? → Merkblatt 3</w:t>
+      </w:r>
+    </w:p>
+    <w:p>
+      <w:r>
+        <w:t>Grund oder Daten? → Merkblatt 4</w:t>
+      </w:r>
+    </w:p>
+    <w:p>
+      <w:r>
+        <w:t>Planen oder prüfen? → Merkblatt 5/6</w:t>
+      </w:r>
+    </w:p>
+    <w:p>
+      <w:r>
+        <w:t>Frage ein Partnerkind oder die Lehrkraft. Sage oder zeige, wo du feststeckst.</w:t>
+      </w:r>
+    </w:p>
+    <w:p>
+      <w:pPr>
+        <w:shd w:fill="EEF2F4"/>
       </w:pPr>
       <w:r>
         <w:rPr>
-          <w:rFonts w:ascii="Aptos" w:hAnsi="Aptos" w:eastAsia="Aptos"/>
           <w:b/>
-          <w:color w:val="7DBB6F"/>
-          <w:sz w:val="22"/>
         </w:rPr>
-        <w:t>Hilfe nutzen ist eine Lernstrategie. Du bleibst trotzdem für deinen Lernweg verantwortlich.</w:t>
+        <w:t>Du darfst direkt fragen</w:t>
+        <w:br/>
+      </w:r>
+      <w:r>
+        <w:t>Kannst du den Auftrag noch nicht lesen oder verstehst du ihn nicht? Bitte sofort um Vorlesen oder Erklären. Du musst nicht alle Hilfen vorher ausprobieren.</w:t>
+      </w:r>
+    </w:p>
+    <w:p>
+      <w:r>
+        <w:t>Hilfe ist beim Üben erlaubt. Für die Probearbeit und die Arbeit erklärt die Lehrkraft, welche Hilfen du nutzen darfst.</w:t>
       </w:r>
     </w:p>
     <w:sectPr>
@@ -2679,9 +1151,14 @@
     <w:name w:val="Normal"/>
     <w:qFormat/>
     <w:rsid w:val="00FC693F"/>
+    <w:pPr>
+      <w:keepNext w:val="0"/>
+      <w:spacing w:after="140" w:before="0" w:line="250" w:lineRule="auto"/>
+    </w:pPr>
     <w:rPr>
-      <w:rFonts w:ascii="Aptos" w:hAnsi="Aptos" w:eastAsia="Aptos"/>
-      <w:sz w:val="23"/>
+      <w:rFonts w:ascii="Arial" w:hAnsi="Arial"/>
+      <w:color w:val="24313A"/>
+      <w:sz w:val="28"/>
     </w:rPr>
   </w:style>
   <w:style w:type="paragraph" w:styleId="Header">
@@ -2739,15 +1216,15 @@
     <w:pPr>
       <w:keepNext/>
       <w:keepLines/>
-      <w:spacing w:before="480" w:after="0"/>
+      <w:spacing w:before="0" w:after="140" w:line="250" w:lineRule="auto"/>
       <w:outlineLvl w:val="0"/>
     </w:pPr>
     <w:rPr>
-      <w:rFonts w:asciiTheme="majorHAnsi" w:eastAsiaTheme="majorEastAsia" w:hAnsiTheme="majorHAnsi" w:cstheme="majorBidi"/>
+      <w:rFonts w:asciiTheme="majorHAnsi" w:eastAsiaTheme="majorEastAsia" w:hAnsiTheme="majorHAnsi" w:cstheme="majorBidi" w:ascii="Arial" w:hAnsi="Arial"/>
       <w:b/>
       <w:bCs/>
-      <w:color w:val="365F91" w:themeColor="accent1" w:themeShade="BF"/>
-      <w:sz w:val="28"/>
+      <w:color w:val="24313A"/>
+      <w:sz w:val="32"/>
       <w:szCs w:val="28"/>
     </w:rPr>
   </w:style>
@@ -2763,15 +1240,15 @@
     <w:pPr>
       <w:keepNext/>
       <w:keepLines/>
-      <w:spacing w:before="200" w:after="0"/>
+      <w:spacing w:before="0" w:after="140" w:line="250" w:lineRule="auto"/>
       <w:outlineLvl w:val="1"/>
     </w:pPr>
     <w:rPr>
-      <w:rFonts w:asciiTheme="majorHAnsi" w:eastAsiaTheme="majorEastAsia" w:hAnsiTheme="majorHAnsi" w:cstheme="majorBidi"/>
+      <w:rFonts w:asciiTheme="majorHAnsi" w:eastAsiaTheme="majorEastAsia" w:hAnsiTheme="majorHAnsi" w:cstheme="majorBidi" w:ascii="Arial" w:hAnsi="Arial"/>
       <w:b/>
       <w:bCs/>
-      <w:color w:val="4F81BD" w:themeColor="accent1"/>
-      <w:sz w:val="26"/>
+      <w:color w:val="24313A"/>
+      <w:sz w:val="28"/>
       <w:szCs w:val="26"/>
     </w:rPr>
   </w:style>
@@ -3025,18 +1502,19 @@
     <w:qFormat/>
     <w:rsid w:val="00FC693F"/>
     <w:pPr>
+      <w:keepNext/>
       <w:pBdr>
         <w:bottom w:val="single" w:sz="8" w:space="4" w:color="4F81BD" w:themeColor="accent1"/>
       </w:pBdr>
-      <w:spacing w:after="300" w:line="240" w:lineRule="auto"/>
+      <w:spacing w:after="140" w:line="250" w:lineRule="auto" w:before="0"/>
       <w:contextualSpacing/>
     </w:pPr>
     <w:rPr>
-      <w:rFonts w:asciiTheme="majorHAnsi" w:eastAsiaTheme="majorEastAsia" w:hAnsiTheme="majorHAnsi" w:cstheme="majorBidi"/>
-      <w:color w:val="17365D" w:themeColor="text2" w:themeShade="BF"/>
+      <w:rFonts w:asciiTheme="majorHAnsi" w:eastAsiaTheme="majorEastAsia" w:hAnsiTheme="majorHAnsi" w:cstheme="majorBidi" w:ascii="Arial" w:hAnsi="Arial"/>
+      <w:color w:val="24313A"/>
       <w:spacing w:val="5"/>
       <w:kern w:val="28"/>
-      <w:sz w:val="52"/>
+      <w:sz w:val="40"/>
       <w:szCs w:val="52"/>
     </w:rPr>
   </w:style>

</xml_diff>